<commit_message>
docs: Ay 2 - 2. Hafta raporu tamamlandı
</commit_message>
<xml_diff>
--- a/ay2/raporlar/Ay2_Hafta2_Rapor.docx
+++ b/ay2/raporlar/Ay2_Hafta2_Rapor.docx
@@ -48,11 +48,15 @@
         <w:pStyle w:val="Balk1"/>
         <w:spacing w:before="300" w:after="150"/>
         <w:rPr>
-          <w:color w:val="000000" w:themeColor="text1"/>
-        </w:rPr>
-      </w:pPr>
-      <w:r>
-        <w:rPr>
+          <w:b/>
+          <w:bCs/>
+          <w:color w:val="000000" w:themeColor="text1"/>
+        </w:rPr>
+      </w:pPr>
+      <w:r>
+        <w:rPr>
+          <w:b/>
+          <w:bCs/>
           <w:color w:val="000000" w:themeColor="text1"/>
         </w:rPr>
         <w:t>1. Tamamlanan Görevler</w:t>
@@ -69,33 +73,40 @@
           <w:szCs w:val="22"/>
         </w:rPr>
       </w:pPr>
-      <w:r>
-        <w:rPr>
-          <w:b/>
-          <w:bCs/>
-          <w:color w:val="000000" w:themeColor="text1"/>
-          <w:sz w:val="22"/>
-          <w:szCs w:val="22"/>
-        </w:rPr>
-        <w:t>Pazartesi</w:t>
-      </w:r>
     </w:p>
     <w:p>
       <w:pPr>
+        <w:spacing w:after="100"/>
+        <w:rPr>
+          <w:b/>
+          <w:bCs/>
+          <w:color w:val="000000" w:themeColor="text1"/>
+          <w:sz w:val="22"/>
+          <w:szCs w:val="22"/>
+        </w:rPr>
+      </w:pPr>
+      <w:r>
+        <w:rPr>
+          <w:b/>
+          <w:bCs/>
+          <w:color w:val="000000" w:themeColor="text1"/>
+          <w:sz w:val="22"/>
+          <w:szCs w:val="22"/>
+        </w:rPr>
+        <w:t>Pazartesi</w:t>
+      </w:r>
+    </w:p>
+    <w:p>
+      <w:pPr>
         <w:spacing w:after="60"/>
-        <w:rPr>
-          <w:color w:val="000000" w:themeColor="text1"/>
-          <w:sz w:val="22"/>
-          <w:szCs w:val="22"/>
-        </w:rPr>
-      </w:pPr>
-      <w:r>
-        <w:rPr>
-          <w:color w:val="000000" w:themeColor="text1"/>
-          <w:sz w:val="22"/>
-          <w:szCs w:val="22"/>
-        </w:rPr>
-        <w:t xml:space="preserve">- </w:t>
+      </w:pPr>
+      <w:r>
+        <w:rPr>
+          <w:color w:val="000000" w:themeColor="text1"/>
+          <w:sz w:val="22"/>
+          <w:szCs w:val="22"/>
+        </w:rPr>
+        <w:t xml:space="preserve">    </w:t>
       </w:r>
       <w:proofErr w:type="spellStart"/>
       <w:r>
@@ -217,29 +228,1221 @@
             <w:sz w:val="22"/>
             <w:szCs w:val="22"/>
           </w:rPr>
-          <w:t>lin</w:t>
-        </w:r>
-        <w:r>
-          <w:rPr>
-            <w:rStyle w:val="Kpr"/>
-            <w:sz w:val="22"/>
-            <w:szCs w:val="22"/>
-          </w:rPr>
-          <w:t>k</w:t>
+          <w:t>link</w:t>
         </w:r>
         <w:proofErr w:type="gramEnd"/>
       </w:hyperlink>
     </w:p>
     <w:p>
       <w:pPr>
+        <w:spacing w:after="60"/>
+        <w:rPr>
+          <w:b/>
+          <w:bCs/>
+          <w:color w:val="000000" w:themeColor="text1"/>
+          <w:sz w:val="22"/>
+          <w:szCs w:val="22"/>
+        </w:rPr>
+      </w:pPr>
+      <w:r>
+        <w:rPr>
+          <w:b/>
+          <w:bCs/>
+          <w:color w:val="000000" w:themeColor="text1"/>
+          <w:sz w:val="22"/>
+          <w:szCs w:val="22"/>
+        </w:rPr>
+        <w:t>Salı</w:t>
+      </w:r>
+    </w:p>
+    <w:p>
+      <w:pPr>
+        <w:spacing w:after="60"/>
+        <w:rPr>
+          <w:color w:val="000000" w:themeColor="text1"/>
+          <w:sz w:val="22"/>
+          <w:szCs w:val="22"/>
+        </w:rPr>
+      </w:pPr>
+      <w:r>
+        <w:rPr>
+          <w:color w:val="000000" w:themeColor="text1"/>
+          <w:sz w:val="22"/>
+          <w:szCs w:val="22"/>
+        </w:rPr>
+        <w:t xml:space="preserve">    </w:t>
+      </w:r>
+      <w:proofErr w:type="spellStart"/>
+      <w:r>
+        <w:rPr>
+          <w:color w:val="000000" w:themeColor="text1"/>
+          <w:sz w:val="22"/>
+          <w:szCs w:val="22"/>
+        </w:rPr>
+        <w:t>Binary</w:t>
+      </w:r>
+      <w:proofErr w:type="spellEnd"/>
+      <w:r>
+        <w:rPr>
+          <w:color w:val="000000" w:themeColor="text1"/>
+          <w:sz w:val="22"/>
+          <w:szCs w:val="22"/>
+        </w:rPr>
+        <w:t xml:space="preserve"> </w:t>
+      </w:r>
+      <w:proofErr w:type="spellStart"/>
+      <w:r>
+        <w:rPr>
+          <w:color w:val="000000" w:themeColor="text1"/>
+          <w:sz w:val="22"/>
+          <w:szCs w:val="22"/>
+        </w:rPr>
+        <w:t>Search'ün</w:t>
+      </w:r>
+      <w:proofErr w:type="spellEnd"/>
+      <w:r>
+        <w:rPr>
+          <w:color w:val="000000" w:themeColor="text1"/>
+          <w:sz w:val="22"/>
+          <w:szCs w:val="22"/>
+        </w:rPr>
+        <w:t xml:space="preserve"> neden </w:t>
+      </w:r>
+      <w:proofErr w:type="gramStart"/>
+      <w:r>
+        <w:rPr>
+          <w:color w:val="000000" w:themeColor="text1"/>
+          <w:sz w:val="22"/>
+          <w:szCs w:val="22"/>
+        </w:rPr>
+        <w:t>O(</w:t>
+      </w:r>
+      <w:proofErr w:type="gramEnd"/>
+      <w:r>
+        <w:rPr>
+          <w:color w:val="000000" w:themeColor="text1"/>
+          <w:sz w:val="22"/>
+          <w:szCs w:val="22"/>
+        </w:rPr>
+        <w:t xml:space="preserve">log n) olduğu, </w:t>
+      </w:r>
+      <w:proofErr w:type="gramStart"/>
+      <w:r>
+        <w:rPr>
+          <w:color w:val="000000" w:themeColor="text1"/>
+          <w:sz w:val="22"/>
+          <w:szCs w:val="22"/>
+        </w:rPr>
+        <w:t>kağıt</w:t>
+      </w:r>
+      <w:proofErr w:type="gramEnd"/>
+      <w:r>
+        <w:rPr>
+          <w:color w:val="000000" w:themeColor="text1"/>
+          <w:sz w:val="22"/>
+          <w:szCs w:val="22"/>
+        </w:rPr>
+        <w:t xml:space="preserve"> üzerinde 8 elemanlı bir liste kullanılarak adım adım gösterildi (8 → 4 → 2 → 1 eleman, 2³=8, log2(</w:t>
+      </w:r>
+      <w:proofErr w:type="gramStart"/>
+      <w:r>
+        <w:rPr>
+          <w:color w:val="000000" w:themeColor="text1"/>
+          <w:sz w:val="22"/>
+          <w:szCs w:val="22"/>
+        </w:rPr>
+        <w:t>8)=</w:t>
+      </w:r>
+      <w:proofErr w:type="gramEnd"/>
+      <w:r>
+        <w:rPr>
+          <w:color w:val="000000" w:themeColor="text1"/>
+          <w:sz w:val="22"/>
+          <w:szCs w:val="22"/>
+        </w:rPr>
+        <w:t xml:space="preserve">3). Kanıt fotoğrafı </w:t>
+      </w:r>
+      <w:proofErr w:type="spellStart"/>
+      <w:r>
+        <w:rPr>
+          <w:color w:val="000000" w:themeColor="text1"/>
+          <w:sz w:val="22"/>
+          <w:szCs w:val="22"/>
+        </w:rPr>
+        <w:t>GitHub'a</w:t>
+      </w:r>
+      <w:proofErr w:type="spellEnd"/>
+      <w:r>
+        <w:rPr>
+          <w:color w:val="000000" w:themeColor="text1"/>
+          <w:sz w:val="22"/>
+          <w:szCs w:val="22"/>
+        </w:rPr>
+        <w:t xml:space="preserve"> eklendi.</w:t>
+      </w:r>
+    </w:p>
+    <w:p>
+      <w:pPr>
+        <w:spacing w:after="60"/>
+        <w:rPr>
+          <w:b/>
+          <w:bCs/>
+          <w:color w:val="000000" w:themeColor="text1"/>
+          <w:sz w:val="22"/>
+          <w:szCs w:val="22"/>
+        </w:rPr>
+      </w:pPr>
+      <w:r>
+        <w:rPr>
+          <w:b/>
+          <w:bCs/>
+          <w:color w:val="000000" w:themeColor="text1"/>
+          <w:sz w:val="22"/>
+          <w:szCs w:val="22"/>
+        </w:rPr>
+        <w:t>Çarşamba-Perşembe</w:t>
+      </w:r>
+    </w:p>
+    <w:p>
+      <w:pPr>
+        <w:spacing w:after="60"/>
+        <w:rPr>
+          <w:color w:val="000000" w:themeColor="text1"/>
+          <w:sz w:val="22"/>
+          <w:szCs w:val="22"/>
+        </w:rPr>
+      </w:pPr>
+      <w:r>
+        <w:rPr>
+          <w:color w:val="000000" w:themeColor="text1"/>
+          <w:sz w:val="22"/>
+          <w:szCs w:val="22"/>
+        </w:rPr>
+        <w:t xml:space="preserve">    </w:t>
+      </w:r>
+      <w:proofErr w:type="spellStart"/>
+      <w:r>
+        <w:rPr>
+          <w:color w:val="000000" w:themeColor="text1"/>
+          <w:sz w:val="22"/>
+          <w:szCs w:val="22"/>
+        </w:rPr>
+        <w:t>Bubble</w:t>
+      </w:r>
+      <w:proofErr w:type="spellEnd"/>
+      <w:r>
+        <w:rPr>
+          <w:color w:val="000000" w:themeColor="text1"/>
+          <w:sz w:val="22"/>
+          <w:szCs w:val="22"/>
+        </w:rPr>
+        <w:t xml:space="preserve"> </w:t>
+      </w:r>
+      <w:proofErr w:type="spellStart"/>
+      <w:r>
+        <w:rPr>
+          <w:color w:val="000000" w:themeColor="text1"/>
+          <w:sz w:val="22"/>
+          <w:szCs w:val="22"/>
+        </w:rPr>
+        <w:t>Sort</w:t>
+      </w:r>
+      <w:proofErr w:type="spellEnd"/>
+      <w:r>
+        <w:rPr>
+          <w:color w:val="000000" w:themeColor="text1"/>
+          <w:sz w:val="22"/>
+          <w:szCs w:val="22"/>
+        </w:rPr>
+        <w:t xml:space="preserve">, </w:t>
+      </w:r>
+      <w:proofErr w:type="spellStart"/>
+      <w:r>
+        <w:rPr>
+          <w:color w:val="000000" w:themeColor="text1"/>
+          <w:sz w:val="22"/>
+          <w:szCs w:val="22"/>
+        </w:rPr>
+        <w:t>Selection</w:t>
+      </w:r>
+      <w:proofErr w:type="spellEnd"/>
+      <w:r>
+        <w:rPr>
+          <w:color w:val="000000" w:themeColor="text1"/>
+          <w:sz w:val="22"/>
+          <w:szCs w:val="22"/>
+        </w:rPr>
+        <w:t xml:space="preserve"> </w:t>
+      </w:r>
+      <w:proofErr w:type="spellStart"/>
+      <w:r>
+        <w:rPr>
+          <w:color w:val="000000" w:themeColor="text1"/>
+          <w:sz w:val="22"/>
+          <w:szCs w:val="22"/>
+        </w:rPr>
+        <w:t>Sort</w:t>
+      </w:r>
+      <w:proofErr w:type="spellEnd"/>
+      <w:r>
+        <w:rPr>
+          <w:color w:val="000000" w:themeColor="text1"/>
+          <w:sz w:val="22"/>
+          <w:szCs w:val="22"/>
+        </w:rPr>
+        <w:t xml:space="preserve"> ve </w:t>
+      </w:r>
+      <w:proofErr w:type="spellStart"/>
+      <w:r>
+        <w:rPr>
+          <w:color w:val="000000" w:themeColor="text1"/>
+          <w:sz w:val="22"/>
+          <w:szCs w:val="22"/>
+        </w:rPr>
+        <w:t>Insertion</w:t>
+      </w:r>
+      <w:proofErr w:type="spellEnd"/>
+      <w:r>
+        <w:rPr>
+          <w:color w:val="000000" w:themeColor="text1"/>
+          <w:sz w:val="22"/>
+          <w:szCs w:val="22"/>
+        </w:rPr>
+        <w:t xml:space="preserve"> </w:t>
+      </w:r>
+      <w:proofErr w:type="spellStart"/>
+      <w:r>
+        <w:rPr>
+          <w:color w:val="000000" w:themeColor="text1"/>
+          <w:sz w:val="22"/>
+          <w:szCs w:val="22"/>
+        </w:rPr>
+        <w:t>Sort</w:t>
+      </w:r>
+      <w:proofErr w:type="spellEnd"/>
+      <w:r>
+        <w:rPr>
+          <w:color w:val="000000" w:themeColor="text1"/>
+          <w:sz w:val="22"/>
+          <w:szCs w:val="22"/>
+        </w:rPr>
+        <w:t xml:space="preserve"> algoritmaları Python'da sıfırdan yazıldı</w:t>
+      </w:r>
+      <w:r>
+        <w:rPr>
+          <w:color w:val="000000" w:themeColor="text1"/>
+          <w:sz w:val="22"/>
+          <w:szCs w:val="22"/>
+        </w:rPr>
+        <w:t>,</w:t>
+      </w:r>
+      <w:r>
+        <w:rPr>
+          <w:color w:val="000000" w:themeColor="text1"/>
+          <w:sz w:val="22"/>
+          <w:szCs w:val="22"/>
+        </w:rPr>
+        <w:t xml:space="preserve"> her algoritmanın her adımı </w:t>
+      </w:r>
+      <w:proofErr w:type="spellStart"/>
+      <w:r>
+        <w:rPr>
+          <w:color w:val="000000" w:themeColor="text1"/>
+          <w:sz w:val="22"/>
+          <w:szCs w:val="22"/>
+        </w:rPr>
+        <w:t>print</w:t>
+      </w:r>
+      <w:proofErr w:type="spellEnd"/>
+      <w:r>
+        <w:rPr>
+          <w:color w:val="000000" w:themeColor="text1"/>
+          <w:sz w:val="22"/>
+          <w:szCs w:val="22"/>
+        </w:rPr>
+        <w:t xml:space="preserve"> ile görselleştirildi.</w:t>
+      </w:r>
+    </w:p>
+    <w:p>
+      <w:pPr>
+        <w:spacing w:after="60"/>
+        <w:rPr>
+          <w:color w:val="000000" w:themeColor="text1"/>
+          <w:sz w:val="22"/>
+          <w:szCs w:val="22"/>
+        </w:rPr>
+      </w:pPr>
+      <w:r>
+        <w:rPr>
+          <w:color w:val="000000" w:themeColor="text1"/>
+          <w:sz w:val="22"/>
+          <w:szCs w:val="22"/>
+        </w:rPr>
+        <w:t xml:space="preserve">    </w:t>
+      </w:r>
+      <w:r>
+        <w:rPr>
+          <w:color w:val="000000" w:themeColor="text1"/>
+          <w:sz w:val="22"/>
+          <w:szCs w:val="22"/>
+        </w:rPr>
+        <w:t>Dört algoritmanın (</w:t>
+      </w:r>
+      <w:proofErr w:type="spellStart"/>
+      <w:r>
+        <w:rPr>
+          <w:color w:val="000000" w:themeColor="text1"/>
+          <w:sz w:val="22"/>
+          <w:szCs w:val="22"/>
+        </w:rPr>
+        <w:t>Linear</w:t>
+      </w:r>
+      <w:proofErr w:type="spellEnd"/>
+      <w:r>
+        <w:rPr>
+          <w:color w:val="000000" w:themeColor="text1"/>
+          <w:sz w:val="22"/>
+          <w:szCs w:val="22"/>
+        </w:rPr>
+        <w:t xml:space="preserve"> </w:t>
+      </w:r>
+      <w:proofErr w:type="spellStart"/>
+      <w:r>
+        <w:rPr>
+          <w:color w:val="000000" w:themeColor="text1"/>
+          <w:sz w:val="22"/>
+          <w:szCs w:val="22"/>
+        </w:rPr>
+        <w:t>Search</w:t>
+      </w:r>
+      <w:proofErr w:type="spellEnd"/>
+      <w:r>
+        <w:rPr>
+          <w:color w:val="000000" w:themeColor="text1"/>
+          <w:sz w:val="22"/>
+          <w:szCs w:val="22"/>
+        </w:rPr>
+        <w:t xml:space="preserve">, </w:t>
+      </w:r>
+      <w:proofErr w:type="spellStart"/>
+      <w:r>
+        <w:rPr>
+          <w:color w:val="000000" w:themeColor="text1"/>
+          <w:sz w:val="22"/>
+          <w:szCs w:val="22"/>
+        </w:rPr>
+        <w:t>Binary</w:t>
+      </w:r>
+      <w:proofErr w:type="spellEnd"/>
+      <w:r>
+        <w:rPr>
+          <w:color w:val="000000" w:themeColor="text1"/>
+          <w:sz w:val="22"/>
+          <w:szCs w:val="22"/>
+        </w:rPr>
+        <w:t xml:space="preserve"> </w:t>
+      </w:r>
+      <w:proofErr w:type="spellStart"/>
+      <w:r>
+        <w:rPr>
+          <w:color w:val="000000" w:themeColor="text1"/>
+          <w:sz w:val="22"/>
+          <w:szCs w:val="22"/>
+        </w:rPr>
+        <w:t>Search</w:t>
+      </w:r>
+      <w:proofErr w:type="spellEnd"/>
+      <w:r>
+        <w:rPr>
+          <w:color w:val="000000" w:themeColor="text1"/>
+          <w:sz w:val="22"/>
+          <w:szCs w:val="22"/>
+        </w:rPr>
+        <w:t xml:space="preserve">, </w:t>
+      </w:r>
+      <w:proofErr w:type="spellStart"/>
+      <w:r>
+        <w:rPr>
+          <w:color w:val="000000" w:themeColor="text1"/>
+          <w:sz w:val="22"/>
+          <w:szCs w:val="22"/>
+        </w:rPr>
+        <w:t>Bubble</w:t>
+      </w:r>
+      <w:proofErr w:type="spellEnd"/>
+      <w:r>
+        <w:rPr>
+          <w:color w:val="000000" w:themeColor="text1"/>
+          <w:sz w:val="22"/>
+          <w:szCs w:val="22"/>
+        </w:rPr>
+        <w:t>/</w:t>
+      </w:r>
+      <w:proofErr w:type="spellStart"/>
+      <w:r>
+        <w:rPr>
+          <w:color w:val="000000" w:themeColor="text1"/>
+          <w:sz w:val="22"/>
+          <w:szCs w:val="22"/>
+        </w:rPr>
+        <w:t>Selection</w:t>
+      </w:r>
+      <w:proofErr w:type="spellEnd"/>
+      <w:r>
+        <w:rPr>
+          <w:color w:val="000000" w:themeColor="text1"/>
+          <w:sz w:val="22"/>
+          <w:szCs w:val="22"/>
+        </w:rPr>
+        <w:t>/</w:t>
+      </w:r>
+      <w:proofErr w:type="spellStart"/>
+      <w:r>
+        <w:rPr>
+          <w:color w:val="000000" w:themeColor="text1"/>
+          <w:sz w:val="22"/>
+          <w:szCs w:val="22"/>
+        </w:rPr>
+        <w:t>Insertion</w:t>
+      </w:r>
+      <w:proofErr w:type="spellEnd"/>
+      <w:r>
+        <w:rPr>
+          <w:color w:val="000000" w:themeColor="text1"/>
+          <w:sz w:val="22"/>
+          <w:szCs w:val="22"/>
+        </w:rPr>
+        <w:t xml:space="preserve"> </w:t>
+      </w:r>
+      <w:proofErr w:type="spellStart"/>
+      <w:r>
+        <w:rPr>
+          <w:color w:val="000000" w:themeColor="text1"/>
+          <w:sz w:val="22"/>
+          <w:szCs w:val="22"/>
+        </w:rPr>
+        <w:t>Sort</w:t>
+      </w:r>
+      <w:proofErr w:type="spellEnd"/>
+      <w:r>
+        <w:rPr>
+          <w:color w:val="000000" w:themeColor="text1"/>
+          <w:sz w:val="22"/>
+          <w:szCs w:val="22"/>
+        </w:rPr>
+        <w:t>) zaman ve alan karmaşıklığı analizleri kod içine yorum olarak eklendi.</w:t>
+      </w:r>
+    </w:p>
+    <w:p>
+      <w:pPr>
+        <w:spacing w:after="60"/>
+        <w:rPr>
+          <w:b/>
+          <w:bCs/>
+          <w:color w:val="000000" w:themeColor="text1"/>
+          <w:sz w:val="22"/>
+          <w:szCs w:val="22"/>
+        </w:rPr>
+      </w:pPr>
+      <w:r>
+        <w:rPr>
+          <w:b/>
+          <w:bCs/>
+          <w:color w:val="000000" w:themeColor="text1"/>
+          <w:sz w:val="22"/>
+          <w:szCs w:val="22"/>
+        </w:rPr>
+        <w:t>Cuma</w:t>
+      </w:r>
+    </w:p>
+    <w:p>
+      <w:pPr>
+        <w:spacing w:after="60"/>
+        <w:rPr>
+          <w:color w:val="000000" w:themeColor="text1"/>
+          <w:sz w:val="22"/>
+          <w:szCs w:val="22"/>
+        </w:rPr>
+      </w:pPr>
+      <w:r>
+        <w:rPr>
+          <w:color w:val="000000" w:themeColor="text1"/>
+          <w:sz w:val="22"/>
+          <w:szCs w:val="22"/>
+        </w:rPr>
+        <w:t xml:space="preserve">    </w:t>
+      </w:r>
+      <w:proofErr w:type="spellStart"/>
+      <w:r>
+        <w:rPr>
+          <w:color w:val="000000" w:themeColor="text1"/>
+          <w:sz w:val="22"/>
+          <w:szCs w:val="22"/>
+        </w:rPr>
+        <w:t>LeetCode</w:t>
+      </w:r>
+      <w:proofErr w:type="spellEnd"/>
+      <w:r>
+        <w:rPr>
+          <w:color w:val="000000" w:themeColor="text1"/>
+          <w:sz w:val="22"/>
+          <w:szCs w:val="22"/>
+        </w:rPr>
+        <w:t xml:space="preserve">: </w:t>
+      </w:r>
+      <w:proofErr w:type="gramStart"/>
+      <w:r>
+        <w:rPr>
+          <w:color w:val="000000" w:themeColor="text1"/>
+          <w:sz w:val="22"/>
+          <w:szCs w:val="22"/>
+        </w:rPr>
+        <w:t>1351 -</w:t>
+      </w:r>
+      <w:proofErr w:type="gramEnd"/>
+      <w:r>
+        <w:rPr>
+          <w:color w:val="000000" w:themeColor="text1"/>
+          <w:sz w:val="22"/>
+          <w:szCs w:val="22"/>
+        </w:rPr>
+        <w:t xml:space="preserve"> </w:t>
+      </w:r>
+      <w:proofErr w:type="spellStart"/>
+      <w:r>
+        <w:rPr>
+          <w:color w:val="000000" w:themeColor="text1"/>
+          <w:sz w:val="22"/>
+          <w:szCs w:val="22"/>
+        </w:rPr>
+        <w:t>Count</w:t>
+      </w:r>
+      <w:proofErr w:type="spellEnd"/>
+      <w:r>
+        <w:rPr>
+          <w:color w:val="000000" w:themeColor="text1"/>
+          <w:sz w:val="22"/>
+          <w:szCs w:val="22"/>
+        </w:rPr>
+        <w:t xml:space="preserve"> </w:t>
+      </w:r>
+      <w:proofErr w:type="spellStart"/>
+      <w:r>
+        <w:rPr>
+          <w:color w:val="000000" w:themeColor="text1"/>
+          <w:sz w:val="22"/>
+          <w:szCs w:val="22"/>
+        </w:rPr>
+        <w:t>Negative</w:t>
+      </w:r>
+      <w:proofErr w:type="spellEnd"/>
+      <w:r>
+        <w:rPr>
+          <w:color w:val="000000" w:themeColor="text1"/>
+          <w:sz w:val="22"/>
+          <w:szCs w:val="22"/>
+        </w:rPr>
+        <w:t xml:space="preserve"> </w:t>
+      </w:r>
+      <w:proofErr w:type="spellStart"/>
+      <w:r>
+        <w:rPr>
+          <w:color w:val="000000" w:themeColor="text1"/>
+          <w:sz w:val="22"/>
+          <w:szCs w:val="22"/>
+        </w:rPr>
+        <w:t>Numbers</w:t>
+      </w:r>
+      <w:proofErr w:type="spellEnd"/>
+      <w:r>
+        <w:rPr>
+          <w:color w:val="000000" w:themeColor="text1"/>
+          <w:sz w:val="22"/>
+          <w:szCs w:val="22"/>
+        </w:rPr>
+        <w:t xml:space="preserve"> in a </w:t>
+      </w:r>
+      <w:proofErr w:type="spellStart"/>
+      <w:r>
+        <w:rPr>
+          <w:color w:val="000000" w:themeColor="text1"/>
+          <w:sz w:val="22"/>
+          <w:szCs w:val="22"/>
+        </w:rPr>
+        <w:t>Sorted</w:t>
+      </w:r>
+      <w:proofErr w:type="spellEnd"/>
+      <w:r>
+        <w:rPr>
+          <w:color w:val="000000" w:themeColor="text1"/>
+          <w:sz w:val="22"/>
+          <w:szCs w:val="22"/>
+        </w:rPr>
+        <w:t xml:space="preserve"> </w:t>
+      </w:r>
+      <w:proofErr w:type="spellStart"/>
+      <w:r>
+        <w:rPr>
+          <w:color w:val="000000" w:themeColor="text1"/>
+          <w:sz w:val="22"/>
+          <w:szCs w:val="22"/>
+        </w:rPr>
+        <w:t>Matrix</w:t>
+      </w:r>
+      <w:proofErr w:type="spellEnd"/>
+      <w:r>
+        <w:rPr>
+          <w:color w:val="000000" w:themeColor="text1"/>
+          <w:sz w:val="22"/>
+          <w:szCs w:val="22"/>
+        </w:rPr>
+        <w:t xml:space="preserve"> (</w:t>
+      </w:r>
+      <w:proofErr w:type="spellStart"/>
+      <w:r>
+        <w:rPr>
+          <w:color w:val="000000" w:themeColor="text1"/>
+          <w:sz w:val="22"/>
+          <w:szCs w:val="22"/>
+        </w:rPr>
+        <w:t>Easy</w:t>
+      </w:r>
+      <w:proofErr w:type="spellEnd"/>
+      <w:r>
+        <w:rPr>
+          <w:color w:val="000000" w:themeColor="text1"/>
+          <w:sz w:val="22"/>
+          <w:szCs w:val="22"/>
+        </w:rPr>
+        <w:t xml:space="preserve">) problemi çözüldü, </w:t>
+      </w:r>
+      <w:proofErr w:type="spellStart"/>
+      <w:r>
+        <w:rPr>
+          <w:color w:val="000000" w:themeColor="text1"/>
+          <w:sz w:val="22"/>
+          <w:szCs w:val="22"/>
+        </w:rPr>
+        <w:t>Big</w:t>
+      </w:r>
+      <w:proofErr w:type="spellEnd"/>
+      <w:r>
+        <w:rPr>
+          <w:color w:val="000000" w:themeColor="text1"/>
+          <w:sz w:val="22"/>
+          <w:szCs w:val="22"/>
+        </w:rPr>
+        <w:t xml:space="preserve">-O analizi </w:t>
+      </w:r>
+      <w:proofErr w:type="spellStart"/>
+      <w:proofErr w:type="gramStart"/>
+      <w:r>
+        <w:rPr>
+          <w:color w:val="000000" w:themeColor="text1"/>
+          <w:sz w:val="22"/>
+          <w:szCs w:val="22"/>
+        </w:rPr>
+        <w:t>yapıldı.</w:t>
+      </w:r>
+      <w:r>
+        <w:rPr>
+          <w:color w:val="000000" w:themeColor="text1"/>
+          <w:sz w:val="22"/>
+          <w:szCs w:val="22"/>
+        </w:rPr>
+        <w:t>s</w:t>
+      </w:r>
+      <w:proofErr w:type="spellEnd"/>
+      <w:proofErr w:type="gramEnd"/>
+    </w:p>
+    <w:p>
+      <w:pPr>
+        <w:spacing w:after="60"/>
+        <w:rPr>
+          <w:b/>
+          <w:bCs/>
+          <w:color w:val="000000" w:themeColor="text1"/>
+          <w:sz w:val="22"/>
+          <w:szCs w:val="22"/>
+        </w:rPr>
+      </w:pPr>
+      <w:r>
+        <w:rPr>
+          <w:b/>
+          <w:bCs/>
+          <w:color w:val="000000" w:themeColor="text1"/>
+          <w:sz w:val="22"/>
+          <w:szCs w:val="22"/>
+        </w:rPr>
+        <w:t>Cumartesi</w:t>
+      </w:r>
+    </w:p>
+    <w:p>
+      <w:pPr>
+        <w:spacing w:after="60"/>
+        <w:rPr>
+          <w:color w:val="000000" w:themeColor="text1"/>
+          <w:sz w:val="22"/>
+          <w:szCs w:val="22"/>
+        </w:rPr>
+      </w:pPr>
+      <w:r>
+        <w:rPr>
+          <w:color w:val="000000" w:themeColor="text1"/>
+          <w:sz w:val="22"/>
+          <w:szCs w:val="22"/>
+        </w:rPr>
+        <w:t xml:space="preserve">    </w:t>
+      </w:r>
+      <w:proofErr w:type="spellStart"/>
+      <w:r>
+        <w:rPr>
+          <w:color w:val="000000" w:themeColor="text1"/>
+          <w:sz w:val="22"/>
+          <w:szCs w:val="22"/>
+        </w:rPr>
+        <w:t>LeetCode</w:t>
+      </w:r>
+      <w:proofErr w:type="spellEnd"/>
+      <w:r>
+        <w:rPr>
+          <w:color w:val="000000" w:themeColor="text1"/>
+          <w:sz w:val="22"/>
+          <w:szCs w:val="22"/>
+        </w:rPr>
+        <w:t xml:space="preserve">: </w:t>
+      </w:r>
+      <w:proofErr w:type="gramStart"/>
+      <w:r>
+        <w:rPr>
+          <w:color w:val="000000" w:themeColor="text1"/>
+          <w:sz w:val="22"/>
+          <w:szCs w:val="22"/>
+        </w:rPr>
+        <w:t>2517 -</w:t>
+      </w:r>
+      <w:proofErr w:type="gramEnd"/>
+      <w:r>
+        <w:rPr>
+          <w:color w:val="000000" w:themeColor="text1"/>
+          <w:sz w:val="22"/>
+          <w:szCs w:val="22"/>
+        </w:rPr>
+        <w:t xml:space="preserve"> Maximum </w:t>
+      </w:r>
+      <w:proofErr w:type="spellStart"/>
+      <w:r>
+        <w:rPr>
+          <w:color w:val="000000" w:themeColor="text1"/>
+          <w:sz w:val="22"/>
+          <w:szCs w:val="22"/>
+        </w:rPr>
+        <w:t>Tastiness</w:t>
+      </w:r>
+      <w:proofErr w:type="spellEnd"/>
+      <w:r>
+        <w:rPr>
+          <w:color w:val="000000" w:themeColor="text1"/>
+          <w:sz w:val="22"/>
+          <w:szCs w:val="22"/>
+        </w:rPr>
+        <w:t xml:space="preserve"> of </w:t>
+      </w:r>
+      <w:proofErr w:type="spellStart"/>
+      <w:r>
+        <w:rPr>
+          <w:color w:val="000000" w:themeColor="text1"/>
+          <w:sz w:val="22"/>
+          <w:szCs w:val="22"/>
+        </w:rPr>
+        <w:t>Candy</w:t>
+      </w:r>
+      <w:proofErr w:type="spellEnd"/>
+      <w:r>
+        <w:rPr>
+          <w:color w:val="000000" w:themeColor="text1"/>
+          <w:sz w:val="22"/>
+          <w:szCs w:val="22"/>
+        </w:rPr>
+        <w:t xml:space="preserve"> Basket (</w:t>
+      </w:r>
+      <w:proofErr w:type="spellStart"/>
+      <w:r>
+        <w:rPr>
+          <w:color w:val="000000" w:themeColor="text1"/>
+          <w:sz w:val="22"/>
+          <w:szCs w:val="22"/>
+        </w:rPr>
+        <w:t>Medium</w:t>
+      </w:r>
+      <w:proofErr w:type="spellEnd"/>
+      <w:r>
+        <w:rPr>
+          <w:color w:val="000000" w:themeColor="text1"/>
+          <w:sz w:val="22"/>
+          <w:szCs w:val="22"/>
+        </w:rPr>
+        <w:t>) problemi çözüldü</w:t>
+      </w:r>
+      <w:r>
+        <w:rPr>
+          <w:color w:val="000000" w:themeColor="text1"/>
+          <w:sz w:val="22"/>
+          <w:szCs w:val="22"/>
+        </w:rPr>
+        <w:t>,</w:t>
+      </w:r>
+      <w:r>
+        <w:rPr>
+          <w:color w:val="000000" w:themeColor="text1"/>
+          <w:sz w:val="22"/>
+          <w:szCs w:val="22"/>
+        </w:rPr>
+        <w:t xml:space="preserve"> "cevap üzerinde </w:t>
+      </w:r>
+      <w:proofErr w:type="spellStart"/>
+      <w:r>
+        <w:rPr>
+          <w:color w:val="000000" w:themeColor="text1"/>
+          <w:sz w:val="22"/>
+          <w:szCs w:val="22"/>
+        </w:rPr>
+        <w:t>binary</w:t>
+      </w:r>
+      <w:proofErr w:type="spellEnd"/>
+      <w:r>
+        <w:rPr>
+          <w:color w:val="000000" w:themeColor="text1"/>
+          <w:sz w:val="22"/>
+          <w:szCs w:val="22"/>
+        </w:rPr>
+        <w:t xml:space="preserve"> </w:t>
+      </w:r>
+      <w:proofErr w:type="spellStart"/>
+      <w:r>
+        <w:rPr>
+          <w:color w:val="000000" w:themeColor="text1"/>
+          <w:sz w:val="22"/>
+          <w:szCs w:val="22"/>
+        </w:rPr>
+        <w:t>search</w:t>
+      </w:r>
+      <w:proofErr w:type="spellEnd"/>
+      <w:r>
+        <w:rPr>
+          <w:color w:val="000000" w:themeColor="text1"/>
+          <w:sz w:val="22"/>
+          <w:szCs w:val="22"/>
+        </w:rPr>
+        <w:t>" tekniği öğrenildi.</w:t>
+      </w:r>
+    </w:p>
+    <w:p>
+      <w:pPr>
+        <w:spacing w:after="60"/>
+        <w:rPr>
+          <w:color w:val="000000" w:themeColor="text1"/>
+          <w:sz w:val="22"/>
+          <w:szCs w:val="22"/>
+        </w:rPr>
+      </w:pPr>
+      <w:r>
+        <w:rPr>
+          <w:color w:val="000000" w:themeColor="text1"/>
+          <w:sz w:val="22"/>
+          <w:szCs w:val="22"/>
+        </w:rPr>
+        <w:t xml:space="preserve">    </w:t>
+      </w:r>
+      <w:r>
+        <w:rPr>
+          <w:color w:val="000000" w:themeColor="text1"/>
+          <w:sz w:val="22"/>
+          <w:szCs w:val="22"/>
+        </w:rPr>
+        <w:t>"</w:t>
+      </w:r>
+      <w:proofErr w:type="spellStart"/>
+      <w:r>
+        <w:rPr>
+          <w:color w:val="000000" w:themeColor="text1"/>
+          <w:sz w:val="22"/>
+          <w:szCs w:val="22"/>
+        </w:rPr>
+        <w:t>Big</w:t>
+      </w:r>
+      <w:proofErr w:type="spellEnd"/>
+      <w:r>
+        <w:rPr>
+          <w:color w:val="000000" w:themeColor="text1"/>
+          <w:sz w:val="22"/>
+          <w:szCs w:val="22"/>
+        </w:rPr>
+        <w:t xml:space="preserve"> O </w:t>
+      </w:r>
+      <w:proofErr w:type="spellStart"/>
+      <w:r>
+        <w:rPr>
+          <w:color w:val="000000" w:themeColor="text1"/>
+          <w:sz w:val="22"/>
+          <w:szCs w:val="22"/>
+        </w:rPr>
+        <w:t>Notation</w:t>
+      </w:r>
+      <w:proofErr w:type="spellEnd"/>
+      <w:r>
+        <w:rPr>
+          <w:color w:val="000000" w:themeColor="text1"/>
+          <w:sz w:val="22"/>
+          <w:szCs w:val="22"/>
+        </w:rPr>
+        <w:t xml:space="preserve"> </w:t>
+      </w:r>
+      <w:proofErr w:type="spellStart"/>
+      <w:r>
+        <w:rPr>
+          <w:color w:val="000000" w:themeColor="text1"/>
+          <w:sz w:val="22"/>
+          <w:szCs w:val="22"/>
+        </w:rPr>
+        <w:t>Explained</w:t>
+      </w:r>
+      <w:proofErr w:type="spellEnd"/>
+      <w:r>
+        <w:rPr>
+          <w:color w:val="000000" w:themeColor="text1"/>
+          <w:sz w:val="22"/>
+          <w:szCs w:val="22"/>
+        </w:rPr>
+        <w:t>" (dev.to) makalesi okundu ve özetlendi.</w:t>
+      </w:r>
+    </w:p>
+    <w:p>
+      <w:pPr>
+        <w:spacing w:after="60"/>
+        <w:rPr>
+          <w:b/>
+          <w:bCs/>
+          <w:color w:val="000000" w:themeColor="text1"/>
+          <w:sz w:val="22"/>
+          <w:szCs w:val="22"/>
+        </w:rPr>
+      </w:pPr>
+      <w:r>
+        <w:rPr>
+          <w:b/>
+          <w:bCs/>
+          <w:color w:val="000000" w:themeColor="text1"/>
+          <w:sz w:val="22"/>
+          <w:szCs w:val="22"/>
+        </w:rPr>
+        <w:t>Pazar</w:t>
+      </w:r>
+    </w:p>
+    <w:p>
+      <w:pPr>
+        <w:spacing w:after="60"/>
+        <w:rPr>
+          <w:color w:val="000000" w:themeColor="text1"/>
+          <w:sz w:val="22"/>
+          <w:szCs w:val="22"/>
+        </w:rPr>
+      </w:pPr>
+      <w:r>
+        <w:rPr>
+          <w:color w:val="000000" w:themeColor="text1"/>
+          <w:sz w:val="22"/>
+          <w:szCs w:val="22"/>
+        </w:rPr>
+        <w:t xml:space="preserve">    </w:t>
+      </w:r>
+      <w:proofErr w:type="spellStart"/>
+      <w:r>
+        <w:rPr>
+          <w:color w:val="000000" w:themeColor="text1"/>
+          <w:sz w:val="22"/>
+          <w:szCs w:val="22"/>
+        </w:rPr>
+        <w:t>LeetCode</w:t>
+      </w:r>
+      <w:proofErr w:type="spellEnd"/>
+      <w:r>
+        <w:rPr>
+          <w:color w:val="000000" w:themeColor="text1"/>
+          <w:sz w:val="22"/>
+          <w:szCs w:val="22"/>
+        </w:rPr>
+        <w:t xml:space="preserve">: </w:t>
+      </w:r>
+      <w:proofErr w:type="gramStart"/>
+      <w:r>
+        <w:rPr>
+          <w:color w:val="000000" w:themeColor="text1"/>
+          <w:sz w:val="22"/>
+          <w:szCs w:val="22"/>
+        </w:rPr>
+        <w:t>3477 -</w:t>
+      </w:r>
+      <w:proofErr w:type="gramEnd"/>
+      <w:r>
+        <w:rPr>
+          <w:color w:val="000000" w:themeColor="text1"/>
+          <w:sz w:val="22"/>
+          <w:szCs w:val="22"/>
+        </w:rPr>
+        <w:t xml:space="preserve"> </w:t>
+      </w:r>
+      <w:proofErr w:type="spellStart"/>
+      <w:r>
+        <w:rPr>
+          <w:color w:val="000000" w:themeColor="text1"/>
+          <w:sz w:val="22"/>
+          <w:szCs w:val="22"/>
+        </w:rPr>
+        <w:t>Fruits</w:t>
+      </w:r>
+      <w:proofErr w:type="spellEnd"/>
+      <w:r>
+        <w:rPr>
+          <w:color w:val="000000" w:themeColor="text1"/>
+          <w:sz w:val="22"/>
+          <w:szCs w:val="22"/>
+        </w:rPr>
+        <w:t xml:space="preserve"> </w:t>
+      </w:r>
+      <w:proofErr w:type="spellStart"/>
+      <w:r>
+        <w:rPr>
+          <w:color w:val="000000" w:themeColor="text1"/>
+          <w:sz w:val="22"/>
+          <w:szCs w:val="22"/>
+        </w:rPr>
+        <w:t>Into</w:t>
+      </w:r>
+      <w:proofErr w:type="spellEnd"/>
+      <w:r>
+        <w:rPr>
+          <w:color w:val="000000" w:themeColor="text1"/>
+          <w:sz w:val="22"/>
+          <w:szCs w:val="22"/>
+        </w:rPr>
+        <w:t xml:space="preserve"> </w:t>
+      </w:r>
+      <w:proofErr w:type="spellStart"/>
+      <w:r>
+        <w:rPr>
+          <w:color w:val="000000" w:themeColor="text1"/>
+          <w:sz w:val="22"/>
+          <w:szCs w:val="22"/>
+        </w:rPr>
+        <w:t>Baskets</w:t>
+      </w:r>
+      <w:proofErr w:type="spellEnd"/>
+      <w:r>
+        <w:rPr>
+          <w:color w:val="000000" w:themeColor="text1"/>
+          <w:sz w:val="22"/>
+          <w:szCs w:val="22"/>
+        </w:rPr>
+        <w:t xml:space="preserve"> II (</w:t>
+      </w:r>
+      <w:proofErr w:type="spellStart"/>
+      <w:r>
+        <w:rPr>
+          <w:color w:val="000000" w:themeColor="text1"/>
+          <w:sz w:val="22"/>
+          <w:szCs w:val="22"/>
+        </w:rPr>
+        <w:t>Easy</w:t>
+      </w:r>
+      <w:proofErr w:type="spellEnd"/>
+      <w:r>
+        <w:rPr>
+          <w:color w:val="000000" w:themeColor="text1"/>
+          <w:sz w:val="22"/>
+          <w:szCs w:val="22"/>
+        </w:rPr>
+        <w:t xml:space="preserve">) problemi çözüldü. Bu problemle Hafta 2 planındaki 2 </w:t>
+      </w:r>
+      <w:proofErr w:type="spellStart"/>
+      <w:r>
+        <w:rPr>
+          <w:color w:val="000000" w:themeColor="text1"/>
+          <w:sz w:val="22"/>
+          <w:szCs w:val="22"/>
+        </w:rPr>
+        <w:t>Easy</w:t>
+      </w:r>
+      <w:proofErr w:type="spellEnd"/>
+      <w:r>
+        <w:rPr>
+          <w:color w:val="000000" w:themeColor="text1"/>
+          <w:sz w:val="22"/>
+          <w:szCs w:val="22"/>
+        </w:rPr>
+        <w:t xml:space="preserve"> + 1 </w:t>
+      </w:r>
+      <w:proofErr w:type="spellStart"/>
+      <w:r>
+        <w:rPr>
+          <w:color w:val="000000" w:themeColor="text1"/>
+          <w:sz w:val="22"/>
+          <w:szCs w:val="22"/>
+        </w:rPr>
+        <w:t>Medium</w:t>
+      </w:r>
+      <w:proofErr w:type="spellEnd"/>
+      <w:r>
+        <w:rPr>
+          <w:color w:val="000000" w:themeColor="text1"/>
+          <w:sz w:val="22"/>
+          <w:szCs w:val="22"/>
+        </w:rPr>
+        <w:t xml:space="preserve"> </w:t>
+      </w:r>
+      <w:proofErr w:type="spellStart"/>
+      <w:r>
+        <w:rPr>
+          <w:color w:val="000000" w:themeColor="text1"/>
+          <w:sz w:val="22"/>
+          <w:szCs w:val="22"/>
+        </w:rPr>
+        <w:t>LeetCode</w:t>
+      </w:r>
+      <w:proofErr w:type="spellEnd"/>
+      <w:r>
+        <w:rPr>
+          <w:color w:val="000000" w:themeColor="text1"/>
+          <w:sz w:val="22"/>
+          <w:szCs w:val="22"/>
+        </w:rPr>
+        <w:t xml:space="preserve"> hedefi tamamlandı.</w:t>
+      </w:r>
+    </w:p>
+    <w:p>
+      <w:pPr>
+        <w:spacing w:after="60"/>
+        <w:rPr>
+          <w:color w:val="000000" w:themeColor="text1"/>
+          <w:sz w:val="22"/>
+          <w:szCs w:val="22"/>
+        </w:rPr>
+      </w:pPr>
+    </w:p>
+    <w:p>
+      <w:pPr>
         <w:pStyle w:val="Balk1"/>
         <w:spacing w:before="300" w:after="150"/>
         <w:rPr>
-          <w:color w:val="000000" w:themeColor="text1"/>
-        </w:rPr>
-      </w:pPr>
-      <w:r>
-        <w:rPr>
+          <w:b/>
+          <w:bCs/>
+          <w:color w:val="000000" w:themeColor="text1"/>
+        </w:rPr>
+      </w:pPr>
+      <w:r>
+        <w:rPr>
+          <w:b/>
+          <w:bCs/>
           <w:color w:val="000000" w:themeColor="text1"/>
         </w:rPr>
         <w:t xml:space="preserve">2. </w:t>
@@ -247,6 +1450,8 @@
       <w:proofErr w:type="spellStart"/>
       <w:r>
         <w:rPr>
+          <w:b/>
+          <w:bCs/>
           <w:color w:val="000000" w:themeColor="text1"/>
         </w:rPr>
         <w:t>LeetCode</w:t>
@@ -254,6 +1459,8 @@
       <w:proofErr w:type="spellEnd"/>
       <w:r>
         <w:rPr>
+          <w:b/>
+          <w:bCs/>
           <w:color w:val="000000" w:themeColor="text1"/>
         </w:rPr>
         <w:t xml:space="preserve"> Çözümleri</w:t>
@@ -265,13 +1472,195 @@
         <w:spacing w:before="300" w:after="150"/>
         <w:rPr>
           <w:color w:val="000000" w:themeColor="text1"/>
-        </w:rPr>
-      </w:pPr>
-      <w:r>
-        <w:rPr>
-          <w:color w:val="000000" w:themeColor="text1"/>
-        </w:rPr>
-        <w:t>3. Teknik Kaynak Özeti</w:t>
+          <w:sz w:val="22"/>
+          <w:szCs w:val="22"/>
+        </w:rPr>
+      </w:pPr>
+      <w:r>
+        <w:rPr>
+          <w:b/>
+          <w:bCs/>
+          <w:color w:val="000000" w:themeColor="text1"/>
+          <w:sz w:val="22"/>
+          <w:szCs w:val="22"/>
+        </w:rPr>
+        <w:t>1)</w:t>
+      </w:r>
+      <w:proofErr w:type="spellStart"/>
+      <w:r>
+        <w:rPr>
+          <w:b/>
+          <w:bCs/>
+          <w:color w:val="000000" w:themeColor="text1"/>
+          <w:sz w:val="22"/>
+          <w:szCs w:val="22"/>
+        </w:rPr>
+        <w:t>LeetCode</w:t>
+      </w:r>
+      <w:proofErr w:type="spellEnd"/>
+      <w:r>
+        <w:rPr>
+          <w:b/>
+          <w:bCs/>
+          <w:color w:val="000000" w:themeColor="text1"/>
+          <w:sz w:val="22"/>
+          <w:szCs w:val="22"/>
+        </w:rPr>
+        <w:t xml:space="preserve"> </w:t>
+      </w:r>
+      <w:proofErr w:type="gramStart"/>
+      <w:r>
+        <w:rPr>
+          <w:b/>
+          <w:bCs/>
+          <w:color w:val="000000" w:themeColor="text1"/>
+          <w:sz w:val="22"/>
+          <w:szCs w:val="22"/>
+        </w:rPr>
+        <w:t>1351 -</w:t>
+      </w:r>
+      <w:proofErr w:type="gramEnd"/>
+      <w:r>
+        <w:rPr>
+          <w:b/>
+          <w:bCs/>
+          <w:color w:val="000000" w:themeColor="text1"/>
+          <w:sz w:val="22"/>
+          <w:szCs w:val="22"/>
+        </w:rPr>
+        <w:t xml:space="preserve"> </w:t>
+      </w:r>
+      <w:proofErr w:type="spellStart"/>
+      <w:r>
+        <w:rPr>
+          <w:b/>
+          <w:bCs/>
+          <w:color w:val="000000" w:themeColor="text1"/>
+          <w:sz w:val="22"/>
+          <w:szCs w:val="22"/>
+        </w:rPr>
+        <w:t>Count</w:t>
+      </w:r>
+      <w:proofErr w:type="spellEnd"/>
+      <w:r>
+        <w:rPr>
+          <w:b/>
+          <w:bCs/>
+          <w:color w:val="000000" w:themeColor="text1"/>
+          <w:sz w:val="22"/>
+          <w:szCs w:val="22"/>
+        </w:rPr>
+        <w:t xml:space="preserve"> </w:t>
+      </w:r>
+      <w:proofErr w:type="spellStart"/>
+      <w:r>
+        <w:rPr>
+          <w:b/>
+          <w:bCs/>
+          <w:color w:val="000000" w:themeColor="text1"/>
+          <w:sz w:val="22"/>
+          <w:szCs w:val="22"/>
+        </w:rPr>
+        <w:t>Negative</w:t>
+      </w:r>
+      <w:proofErr w:type="spellEnd"/>
+      <w:r>
+        <w:rPr>
+          <w:b/>
+          <w:bCs/>
+          <w:color w:val="000000" w:themeColor="text1"/>
+          <w:sz w:val="22"/>
+          <w:szCs w:val="22"/>
+        </w:rPr>
+        <w:t xml:space="preserve"> </w:t>
+      </w:r>
+      <w:proofErr w:type="spellStart"/>
+      <w:r>
+        <w:rPr>
+          <w:b/>
+          <w:bCs/>
+          <w:color w:val="000000" w:themeColor="text1"/>
+          <w:sz w:val="22"/>
+          <w:szCs w:val="22"/>
+        </w:rPr>
+        <w:t>Numbers</w:t>
+      </w:r>
+      <w:proofErr w:type="spellEnd"/>
+      <w:r>
+        <w:rPr>
+          <w:b/>
+          <w:bCs/>
+          <w:color w:val="000000" w:themeColor="text1"/>
+          <w:sz w:val="22"/>
+          <w:szCs w:val="22"/>
+        </w:rPr>
+        <w:t xml:space="preserve"> in a </w:t>
+      </w:r>
+      <w:proofErr w:type="spellStart"/>
+      <w:r>
+        <w:rPr>
+          <w:b/>
+          <w:bCs/>
+          <w:color w:val="000000" w:themeColor="text1"/>
+          <w:sz w:val="22"/>
+          <w:szCs w:val="22"/>
+        </w:rPr>
+        <w:t>Sorted</w:t>
+      </w:r>
+      <w:proofErr w:type="spellEnd"/>
+      <w:r>
+        <w:rPr>
+          <w:b/>
+          <w:bCs/>
+          <w:color w:val="000000" w:themeColor="text1"/>
+          <w:sz w:val="22"/>
+          <w:szCs w:val="22"/>
+        </w:rPr>
+        <w:t xml:space="preserve"> </w:t>
+      </w:r>
+      <w:proofErr w:type="spellStart"/>
+      <w:r>
+        <w:rPr>
+          <w:b/>
+          <w:bCs/>
+          <w:color w:val="000000" w:themeColor="text1"/>
+          <w:sz w:val="22"/>
+          <w:szCs w:val="22"/>
+        </w:rPr>
+        <w:t>Matrix</w:t>
+      </w:r>
+      <w:proofErr w:type="spellEnd"/>
+      <w:r>
+        <w:rPr>
+          <w:b/>
+          <w:bCs/>
+          <w:color w:val="000000" w:themeColor="text1"/>
+          <w:sz w:val="22"/>
+          <w:szCs w:val="22"/>
+        </w:rPr>
+        <w:t>(</w:t>
+      </w:r>
+      <w:proofErr w:type="spellStart"/>
+      <w:r>
+        <w:rPr>
+          <w:b/>
+          <w:bCs/>
+          <w:color w:val="000000" w:themeColor="text1"/>
+          <w:sz w:val="22"/>
+          <w:szCs w:val="22"/>
+        </w:rPr>
+        <w:t>easy</w:t>
+      </w:r>
+      <w:proofErr w:type="spellEnd"/>
+      <w:r>
+        <w:rPr>
+          <w:b/>
+          <w:bCs/>
+          <w:color w:val="000000" w:themeColor="text1"/>
+          <w:sz w:val="22"/>
+          <w:szCs w:val="22"/>
+        </w:rPr>
+        <w:t>)</w:t>
       </w:r>
     </w:p>
     <w:p>
@@ -280,12 +1669,1599 @@
         <w:spacing w:before="300" w:after="150"/>
         <w:rPr>
           <w:color w:val="000000" w:themeColor="text1"/>
-        </w:rPr>
-      </w:pPr>
-      <w:r>
-        <w:rPr>
-          <w:color w:val="000000" w:themeColor="text1"/>
-        </w:rPr>
+          <w:sz w:val="22"/>
+          <w:szCs w:val="22"/>
+        </w:rPr>
+      </w:pPr>
+      <w:r>
+        <w:rPr>
+          <w:color w:val="000000" w:themeColor="text1"/>
+          <w:sz w:val="22"/>
+          <w:szCs w:val="22"/>
+        </w:rPr>
+        <w:t>Bu problemde matris hem satır hem sütun bazında azalan sırada verilmişti, benden negatif sayıların toplamını bulmam isteniyordu. Matrisin sıralı olduğunu fark edince bir satırda ilk negatifi bulduğumda o noktadan sonrasının da negatif olacağını anladım, bu yüzden kalan elemanları tek tek saymak yerine direkt sayaca ekleyip bir sonraki satıra geçtim.</w:t>
+      </w:r>
+    </w:p>
+    <w:p>
+      <w:pPr>
+        <w:pStyle w:val="Balk1"/>
+        <w:spacing w:before="300" w:after="150"/>
+        <w:rPr>
+          <w:color w:val="000000" w:themeColor="text1"/>
+          <w:sz w:val="22"/>
+          <w:szCs w:val="22"/>
+        </w:rPr>
+      </w:pPr>
+      <w:r>
+        <w:rPr>
+          <w:color w:val="000000" w:themeColor="text1"/>
+          <w:sz w:val="22"/>
+          <w:szCs w:val="22"/>
+        </w:rPr>
+        <w:t xml:space="preserve">Zaman karmaşıklığı en kötü durumda O of m çarpı n oldu, alan karmaşıklığı ise sadece bir sayaç tuttuğum için O of 1 kaldı. İlerleyen zamanda </w:t>
+      </w:r>
+      <w:proofErr w:type="spellStart"/>
+      <w:r>
+        <w:rPr>
+          <w:color w:val="000000" w:themeColor="text1"/>
+          <w:sz w:val="22"/>
+          <w:szCs w:val="22"/>
+        </w:rPr>
+        <w:t>binary</w:t>
+      </w:r>
+      <w:proofErr w:type="spellEnd"/>
+      <w:r>
+        <w:rPr>
+          <w:color w:val="000000" w:themeColor="text1"/>
+          <w:sz w:val="22"/>
+          <w:szCs w:val="22"/>
+        </w:rPr>
+        <w:t xml:space="preserve"> </w:t>
+      </w:r>
+      <w:proofErr w:type="spellStart"/>
+      <w:r>
+        <w:rPr>
+          <w:color w:val="000000" w:themeColor="text1"/>
+          <w:sz w:val="22"/>
+          <w:szCs w:val="22"/>
+        </w:rPr>
+        <w:t>search</w:t>
+      </w:r>
+      <w:proofErr w:type="spellEnd"/>
+      <w:r>
+        <w:rPr>
+          <w:color w:val="000000" w:themeColor="text1"/>
+          <w:sz w:val="22"/>
+          <w:szCs w:val="22"/>
+        </w:rPr>
+        <w:t xml:space="preserve"> kullanarak bunu daha da hızlandırabileceğimi öğrendim ama bu hafta mevcut çözümümle bıraktım.</w:t>
+      </w:r>
+    </w:p>
+    <w:p>
+      <w:pPr>
+        <w:pStyle w:val="Balk1"/>
+        <w:spacing w:before="300" w:after="150"/>
+        <w:rPr>
+          <w:b/>
+          <w:bCs/>
+          <w:color w:val="000000" w:themeColor="text1"/>
+          <w:sz w:val="22"/>
+          <w:szCs w:val="22"/>
+          <w:u w:val="single"/>
+        </w:rPr>
+      </w:pPr>
+    </w:p>
+    <w:p>
+      <w:pPr>
+        <w:pStyle w:val="Balk1"/>
+        <w:spacing w:before="300" w:after="150"/>
+        <w:rPr>
+          <w:b/>
+          <w:bCs/>
+          <w:color w:val="000000" w:themeColor="text1"/>
+          <w:sz w:val="22"/>
+          <w:szCs w:val="22"/>
+          <w:u w:val="single"/>
+        </w:rPr>
+      </w:pPr>
+    </w:p>
+    <w:p>
+      <w:pPr>
+        <w:pStyle w:val="Balk1"/>
+        <w:spacing w:before="300" w:after="150"/>
+        <w:rPr>
+          <w:color w:val="000000" w:themeColor="text1"/>
+          <w:sz w:val="22"/>
+          <w:szCs w:val="22"/>
+          <w:u w:val="single"/>
+        </w:rPr>
+      </w:pPr>
+      <w:r>
+        <w:rPr>
+          <w:b/>
+          <w:bCs/>
+          <w:color w:val="000000" w:themeColor="text1"/>
+          <w:sz w:val="22"/>
+          <w:szCs w:val="22"/>
+          <w:u w:val="single"/>
+        </w:rPr>
+        <w:lastRenderedPageBreak/>
+        <w:t>2)</w:t>
+      </w:r>
+      <w:proofErr w:type="spellStart"/>
+      <w:r>
+        <w:rPr>
+          <w:b/>
+          <w:bCs/>
+          <w:color w:val="000000" w:themeColor="text1"/>
+          <w:sz w:val="22"/>
+          <w:szCs w:val="22"/>
+          <w:u w:val="single"/>
+        </w:rPr>
+        <w:t>LeetCode</w:t>
+      </w:r>
+      <w:proofErr w:type="spellEnd"/>
+      <w:r>
+        <w:rPr>
+          <w:b/>
+          <w:bCs/>
+          <w:color w:val="000000" w:themeColor="text1"/>
+          <w:sz w:val="22"/>
+          <w:szCs w:val="22"/>
+          <w:u w:val="single"/>
+        </w:rPr>
+        <w:t xml:space="preserve"> </w:t>
+      </w:r>
+      <w:proofErr w:type="gramStart"/>
+      <w:r>
+        <w:rPr>
+          <w:b/>
+          <w:bCs/>
+          <w:color w:val="000000" w:themeColor="text1"/>
+          <w:sz w:val="22"/>
+          <w:szCs w:val="22"/>
+          <w:u w:val="single"/>
+        </w:rPr>
+        <w:t>2517 -</w:t>
+      </w:r>
+      <w:proofErr w:type="gramEnd"/>
+      <w:r>
+        <w:rPr>
+          <w:b/>
+          <w:bCs/>
+          <w:color w:val="000000" w:themeColor="text1"/>
+          <w:sz w:val="22"/>
+          <w:szCs w:val="22"/>
+          <w:u w:val="single"/>
+        </w:rPr>
+        <w:t xml:space="preserve"> Maximum </w:t>
+      </w:r>
+      <w:proofErr w:type="spellStart"/>
+      <w:r>
+        <w:rPr>
+          <w:b/>
+          <w:bCs/>
+          <w:color w:val="000000" w:themeColor="text1"/>
+          <w:sz w:val="22"/>
+          <w:szCs w:val="22"/>
+          <w:u w:val="single"/>
+        </w:rPr>
+        <w:t>Tastiness</w:t>
+      </w:r>
+      <w:proofErr w:type="spellEnd"/>
+      <w:r>
+        <w:rPr>
+          <w:b/>
+          <w:bCs/>
+          <w:color w:val="000000" w:themeColor="text1"/>
+          <w:sz w:val="22"/>
+          <w:szCs w:val="22"/>
+          <w:u w:val="single"/>
+        </w:rPr>
+        <w:t xml:space="preserve"> of </w:t>
+      </w:r>
+      <w:proofErr w:type="spellStart"/>
+      <w:r>
+        <w:rPr>
+          <w:b/>
+          <w:bCs/>
+          <w:color w:val="000000" w:themeColor="text1"/>
+          <w:sz w:val="22"/>
+          <w:szCs w:val="22"/>
+          <w:u w:val="single"/>
+        </w:rPr>
+        <w:t>Candy</w:t>
+      </w:r>
+      <w:proofErr w:type="spellEnd"/>
+      <w:r>
+        <w:rPr>
+          <w:b/>
+          <w:bCs/>
+          <w:color w:val="000000" w:themeColor="text1"/>
+          <w:sz w:val="22"/>
+          <w:szCs w:val="22"/>
+          <w:u w:val="single"/>
+        </w:rPr>
+        <w:t xml:space="preserve"> Basket(</w:t>
+      </w:r>
+      <w:proofErr w:type="spellStart"/>
+      <w:r>
+        <w:rPr>
+          <w:b/>
+          <w:bCs/>
+          <w:color w:val="000000" w:themeColor="text1"/>
+          <w:sz w:val="22"/>
+          <w:szCs w:val="22"/>
+          <w:u w:val="single"/>
+        </w:rPr>
+        <w:t>medium</w:t>
+      </w:r>
+      <w:proofErr w:type="spellEnd"/>
+      <w:r>
+        <w:rPr>
+          <w:b/>
+          <w:bCs/>
+          <w:color w:val="000000" w:themeColor="text1"/>
+          <w:sz w:val="22"/>
+          <w:szCs w:val="22"/>
+          <w:u w:val="single"/>
+        </w:rPr>
+        <w:t>)</w:t>
+      </w:r>
+    </w:p>
+    <w:p>
+      <w:pPr>
+        <w:pStyle w:val="Balk1"/>
+        <w:spacing w:before="300" w:after="150"/>
+        <w:rPr>
+          <w:color w:val="000000" w:themeColor="text1"/>
+          <w:sz w:val="22"/>
+          <w:szCs w:val="22"/>
+        </w:rPr>
+      </w:pPr>
+      <w:r>
+        <w:rPr>
+          <w:color w:val="000000" w:themeColor="text1"/>
+          <w:sz w:val="22"/>
+          <w:szCs w:val="22"/>
+        </w:rPr>
+        <w:t>Bu problemde k tane farklı şeker seçip seçtiğim şekerler arasındaki en küçük fiyat farkını mümkün olduğunca büyük yapmam isteniyordu. İlk başta biraz zorlandım çünkü klasik bir arama değil olası bir cevabı arıyordum. Fiyatları sıraladıktan sonra</w:t>
+      </w:r>
+      <w:r>
+        <w:rPr>
+          <w:color w:val="000000" w:themeColor="text1"/>
+          <w:sz w:val="22"/>
+          <w:szCs w:val="22"/>
+        </w:rPr>
+        <w:t xml:space="preserve"> </w:t>
+      </w:r>
+      <w:r>
+        <w:rPr>
+          <w:color w:val="000000" w:themeColor="text1"/>
+          <w:sz w:val="22"/>
+          <w:szCs w:val="22"/>
+        </w:rPr>
+        <w:t xml:space="preserve">mümkün olan minimum fark değerleri üzerinde </w:t>
+      </w:r>
+      <w:proofErr w:type="spellStart"/>
+      <w:r>
+        <w:rPr>
+          <w:color w:val="000000" w:themeColor="text1"/>
+          <w:sz w:val="22"/>
+          <w:szCs w:val="22"/>
+        </w:rPr>
+        <w:t>binary</w:t>
+      </w:r>
+      <w:proofErr w:type="spellEnd"/>
+      <w:r>
+        <w:rPr>
+          <w:color w:val="000000" w:themeColor="text1"/>
+          <w:sz w:val="22"/>
+          <w:szCs w:val="22"/>
+        </w:rPr>
+        <w:t xml:space="preserve"> </w:t>
+      </w:r>
+      <w:proofErr w:type="spellStart"/>
+      <w:r>
+        <w:rPr>
+          <w:color w:val="000000" w:themeColor="text1"/>
+          <w:sz w:val="22"/>
+          <w:szCs w:val="22"/>
+        </w:rPr>
+        <w:t>search</w:t>
+      </w:r>
+      <w:proofErr w:type="spellEnd"/>
+      <w:r>
+        <w:rPr>
+          <w:color w:val="000000" w:themeColor="text1"/>
+          <w:sz w:val="22"/>
+          <w:szCs w:val="22"/>
+        </w:rPr>
+        <w:t xml:space="preserve"> yaptım</w:t>
+      </w:r>
+      <w:r>
+        <w:rPr>
+          <w:color w:val="000000" w:themeColor="text1"/>
+          <w:sz w:val="22"/>
+          <w:szCs w:val="22"/>
+        </w:rPr>
+        <w:t>.</w:t>
+      </w:r>
+      <w:r>
+        <w:rPr>
+          <w:color w:val="000000" w:themeColor="text1"/>
+          <w:sz w:val="22"/>
+          <w:szCs w:val="22"/>
+        </w:rPr>
+        <w:t xml:space="preserve"> </w:t>
+      </w:r>
+      <w:r>
+        <w:rPr>
+          <w:color w:val="000000" w:themeColor="text1"/>
+          <w:sz w:val="22"/>
+          <w:szCs w:val="22"/>
+        </w:rPr>
+        <w:t>H</w:t>
+      </w:r>
+      <w:r>
+        <w:rPr>
+          <w:color w:val="000000" w:themeColor="text1"/>
+          <w:sz w:val="22"/>
+          <w:szCs w:val="22"/>
+        </w:rPr>
+        <w:t xml:space="preserve">er adayda, sıralı listeyi gezip </w:t>
+      </w:r>
+      <w:proofErr w:type="spellStart"/>
+      <w:r>
+        <w:rPr>
+          <w:color w:val="000000" w:themeColor="text1"/>
+          <w:sz w:val="22"/>
+          <w:szCs w:val="22"/>
+        </w:rPr>
+        <w:t>greedy</w:t>
+      </w:r>
+      <w:proofErr w:type="spellEnd"/>
+      <w:r>
+        <w:rPr>
+          <w:color w:val="000000" w:themeColor="text1"/>
+          <w:sz w:val="22"/>
+          <w:szCs w:val="22"/>
+        </w:rPr>
+        <w:t xml:space="preserve"> şekilde kaç şeker seçebildiğimi saydım</w:t>
+      </w:r>
+      <w:r>
+        <w:rPr>
+          <w:color w:val="000000" w:themeColor="text1"/>
+          <w:sz w:val="22"/>
+          <w:szCs w:val="22"/>
+        </w:rPr>
+        <w:t xml:space="preserve"> daha sonra</w:t>
+      </w:r>
+      <w:r>
+        <w:rPr>
+          <w:color w:val="000000" w:themeColor="text1"/>
+          <w:sz w:val="22"/>
+          <w:szCs w:val="22"/>
+        </w:rPr>
+        <w:t xml:space="preserve"> </w:t>
+      </w:r>
+      <w:proofErr w:type="spellStart"/>
+      <w:r>
+        <w:rPr>
+          <w:color w:val="000000" w:themeColor="text1"/>
+          <w:sz w:val="22"/>
+          <w:szCs w:val="22"/>
+        </w:rPr>
+        <w:t>k'ya</w:t>
+      </w:r>
+      <w:proofErr w:type="spellEnd"/>
+      <w:r>
+        <w:rPr>
+          <w:color w:val="000000" w:themeColor="text1"/>
+          <w:sz w:val="22"/>
+          <w:szCs w:val="22"/>
+        </w:rPr>
+        <w:t xml:space="preserve"> ulaşabiliyorsam daha büyük bir fark denedim, ulaşamıyorsam daha küçük bir fark denedim.</w:t>
+      </w:r>
+    </w:p>
+    <w:p>
+      <w:pPr>
+        <w:pStyle w:val="Balk1"/>
+        <w:spacing w:before="300" w:after="150"/>
+        <w:rPr>
+          <w:color w:val="000000" w:themeColor="text1"/>
+          <w:sz w:val="22"/>
+          <w:szCs w:val="22"/>
+        </w:rPr>
+      </w:pPr>
+      <w:r>
+        <w:rPr>
+          <w:color w:val="000000" w:themeColor="text1"/>
+          <w:sz w:val="22"/>
+          <w:szCs w:val="22"/>
+        </w:rPr>
+        <w:t xml:space="preserve">Zaman </w:t>
+      </w:r>
+      <w:proofErr w:type="spellStart"/>
+      <w:r>
+        <w:rPr>
+          <w:color w:val="000000" w:themeColor="text1"/>
+          <w:sz w:val="22"/>
+          <w:szCs w:val="22"/>
+        </w:rPr>
+        <w:t>karmaşılığı</w:t>
+      </w:r>
+      <w:proofErr w:type="spellEnd"/>
+      <w:r>
+        <w:rPr>
+          <w:color w:val="000000" w:themeColor="text1"/>
+          <w:sz w:val="22"/>
+          <w:szCs w:val="22"/>
+        </w:rPr>
+        <w:t xml:space="preserve"> O </w:t>
+      </w:r>
+      <w:proofErr w:type="gramStart"/>
+      <w:r>
+        <w:rPr>
+          <w:color w:val="000000" w:themeColor="text1"/>
+          <w:sz w:val="22"/>
+          <w:szCs w:val="22"/>
+        </w:rPr>
+        <w:t>(</w:t>
+      </w:r>
+      <w:r>
+        <w:rPr>
+          <w:color w:val="000000" w:themeColor="text1"/>
+          <w:sz w:val="22"/>
+          <w:szCs w:val="22"/>
+        </w:rPr>
+        <w:t xml:space="preserve"> n</w:t>
+      </w:r>
+      <w:proofErr w:type="gramEnd"/>
+      <w:r>
+        <w:rPr>
+          <w:color w:val="000000" w:themeColor="text1"/>
+          <w:sz w:val="22"/>
+          <w:szCs w:val="22"/>
+        </w:rPr>
+        <w:t xml:space="preserve"> log n</w:t>
+      </w:r>
+      <w:r>
+        <w:rPr>
+          <w:color w:val="000000" w:themeColor="text1"/>
+          <w:sz w:val="22"/>
+          <w:szCs w:val="22"/>
+        </w:rPr>
+        <w:t>)</w:t>
+      </w:r>
+      <w:r>
+        <w:rPr>
+          <w:color w:val="000000" w:themeColor="text1"/>
+          <w:sz w:val="22"/>
+          <w:szCs w:val="22"/>
+        </w:rPr>
+        <w:t xml:space="preserve"> oldu çünkü sıralama ve </w:t>
+      </w:r>
+      <w:proofErr w:type="spellStart"/>
+      <w:r>
+        <w:rPr>
+          <w:color w:val="000000" w:themeColor="text1"/>
+          <w:sz w:val="22"/>
+          <w:szCs w:val="22"/>
+        </w:rPr>
+        <w:t>binary</w:t>
+      </w:r>
+      <w:proofErr w:type="spellEnd"/>
+      <w:r>
+        <w:rPr>
+          <w:color w:val="000000" w:themeColor="text1"/>
+          <w:sz w:val="22"/>
+          <w:szCs w:val="22"/>
+        </w:rPr>
+        <w:t xml:space="preserve"> </w:t>
+      </w:r>
+      <w:proofErr w:type="spellStart"/>
+      <w:r>
+        <w:rPr>
+          <w:color w:val="000000" w:themeColor="text1"/>
+          <w:sz w:val="22"/>
+          <w:szCs w:val="22"/>
+        </w:rPr>
+        <w:t>search</w:t>
+      </w:r>
+      <w:proofErr w:type="spellEnd"/>
+      <w:r>
+        <w:rPr>
+          <w:color w:val="000000" w:themeColor="text1"/>
+          <w:sz w:val="22"/>
+          <w:szCs w:val="22"/>
+        </w:rPr>
+        <w:t xml:space="preserve"> birleşince bu seviyede kaldı, alan karmaşıklığı da O </w:t>
+      </w:r>
+      <w:r>
+        <w:rPr>
+          <w:color w:val="000000" w:themeColor="text1"/>
+          <w:sz w:val="22"/>
+          <w:szCs w:val="22"/>
+        </w:rPr>
+        <w:t>(</w:t>
+      </w:r>
+      <w:r>
+        <w:rPr>
+          <w:color w:val="000000" w:themeColor="text1"/>
+          <w:sz w:val="22"/>
+          <w:szCs w:val="22"/>
+        </w:rPr>
+        <w:t>1</w:t>
+      </w:r>
+      <w:r>
+        <w:rPr>
+          <w:color w:val="000000" w:themeColor="text1"/>
+          <w:sz w:val="22"/>
+          <w:szCs w:val="22"/>
+        </w:rPr>
+        <w:t xml:space="preserve">) </w:t>
+      </w:r>
+      <w:r>
+        <w:rPr>
+          <w:color w:val="000000" w:themeColor="text1"/>
+          <w:sz w:val="22"/>
+          <w:szCs w:val="22"/>
+        </w:rPr>
+        <w:t>oldu çünkü ekstra bir veri yapısı kullanmadım</w:t>
+      </w:r>
+      <w:r>
+        <w:rPr>
+          <w:color w:val="000000" w:themeColor="text1"/>
+          <w:sz w:val="22"/>
+          <w:szCs w:val="22"/>
+        </w:rPr>
+        <w:t>.</w:t>
+      </w:r>
+    </w:p>
+    <w:p>
+      <w:pPr>
+        <w:pStyle w:val="Balk1"/>
+        <w:spacing w:before="300" w:after="150"/>
+        <w:rPr>
+          <w:b/>
+          <w:bCs/>
+          <w:color w:val="000000" w:themeColor="text1"/>
+          <w:sz w:val="22"/>
+          <w:szCs w:val="22"/>
+        </w:rPr>
+      </w:pPr>
+      <w:r>
+        <w:rPr>
+          <w:b/>
+          <w:bCs/>
+          <w:color w:val="000000" w:themeColor="text1"/>
+          <w:sz w:val="22"/>
+          <w:szCs w:val="22"/>
+        </w:rPr>
+        <w:t xml:space="preserve">3) </w:t>
+      </w:r>
+      <w:proofErr w:type="spellStart"/>
+      <w:r>
+        <w:rPr>
+          <w:b/>
+          <w:bCs/>
+          <w:color w:val="000000" w:themeColor="text1"/>
+          <w:sz w:val="22"/>
+          <w:szCs w:val="22"/>
+        </w:rPr>
+        <w:t>LeetCode</w:t>
+      </w:r>
+      <w:proofErr w:type="spellEnd"/>
+      <w:r>
+        <w:rPr>
+          <w:b/>
+          <w:bCs/>
+          <w:color w:val="000000" w:themeColor="text1"/>
+          <w:sz w:val="22"/>
+          <w:szCs w:val="22"/>
+        </w:rPr>
+        <w:t xml:space="preserve"> 3477 -</w:t>
+      </w:r>
+      <w:proofErr w:type="spellStart"/>
+      <w:r>
+        <w:rPr>
+          <w:b/>
+          <w:bCs/>
+          <w:color w:val="000000" w:themeColor="text1"/>
+          <w:sz w:val="22"/>
+          <w:szCs w:val="22"/>
+        </w:rPr>
+        <w:t>Fruits</w:t>
+      </w:r>
+      <w:proofErr w:type="spellEnd"/>
+      <w:r>
+        <w:rPr>
+          <w:b/>
+          <w:bCs/>
+          <w:color w:val="000000" w:themeColor="text1"/>
+          <w:sz w:val="22"/>
+          <w:szCs w:val="22"/>
+        </w:rPr>
+        <w:t xml:space="preserve"> </w:t>
+      </w:r>
+      <w:proofErr w:type="spellStart"/>
+      <w:r>
+        <w:rPr>
+          <w:b/>
+          <w:bCs/>
+          <w:color w:val="000000" w:themeColor="text1"/>
+          <w:sz w:val="22"/>
+          <w:szCs w:val="22"/>
+        </w:rPr>
+        <w:t>Into</w:t>
+      </w:r>
+      <w:proofErr w:type="spellEnd"/>
+      <w:r>
+        <w:rPr>
+          <w:b/>
+          <w:bCs/>
+          <w:color w:val="000000" w:themeColor="text1"/>
+          <w:sz w:val="22"/>
+          <w:szCs w:val="22"/>
+        </w:rPr>
+        <w:t xml:space="preserve"> </w:t>
+      </w:r>
+      <w:proofErr w:type="spellStart"/>
+      <w:r>
+        <w:rPr>
+          <w:b/>
+          <w:bCs/>
+          <w:color w:val="000000" w:themeColor="text1"/>
+          <w:sz w:val="22"/>
+          <w:szCs w:val="22"/>
+        </w:rPr>
+        <w:t>Baskets</w:t>
+      </w:r>
+      <w:proofErr w:type="spellEnd"/>
+      <w:r>
+        <w:rPr>
+          <w:b/>
+          <w:bCs/>
+          <w:color w:val="000000" w:themeColor="text1"/>
+          <w:sz w:val="22"/>
+          <w:szCs w:val="22"/>
+        </w:rPr>
+        <w:t xml:space="preserve"> II (</w:t>
+      </w:r>
+      <w:proofErr w:type="spellStart"/>
+      <w:r>
+        <w:rPr>
+          <w:b/>
+          <w:bCs/>
+          <w:color w:val="000000" w:themeColor="text1"/>
+          <w:sz w:val="22"/>
+          <w:szCs w:val="22"/>
+        </w:rPr>
+        <w:t>Easy</w:t>
+      </w:r>
+      <w:proofErr w:type="spellEnd"/>
+      <w:r>
+        <w:rPr>
+          <w:b/>
+          <w:bCs/>
+          <w:color w:val="000000" w:themeColor="text1"/>
+          <w:sz w:val="22"/>
+          <w:szCs w:val="22"/>
+        </w:rPr>
+        <w:t>)</w:t>
+      </w:r>
+    </w:p>
+    <w:p>
+      <w:pPr>
+        <w:pStyle w:val="Balk1"/>
+        <w:spacing w:before="300" w:after="150"/>
+        <w:rPr>
+          <w:color w:val="000000" w:themeColor="text1"/>
+          <w:sz w:val="22"/>
+          <w:szCs w:val="22"/>
+        </w:rPr>
+      </w:pPr>
+      <w:r>
+        <w:rPr>
+          <w:color w:val="000000" w:themeColor="text1"/>
+          <w:sz w:val="22"/>
+          <w:szCs w:val="22"/>
+        </w:rPr>
+        <w:t>Bu problemde her meyve türünü, kapasitesi yeterli olan ve henüz kullanılmamış ilk sepete soldan sağa doğru yerleştirme</w:t>
+      </w:r>
+      <w:r>
+        <w:rPr>
+          <w:color w:val="000000" w:themeColor="text1"/>
+          <w:sz w:val="22"/>
+          <w:szCs w:val="22"/>
+        </w:rPr>
+        <w:t>miz</w:t>
+      </w:r>
+      <w:r>
+        <w:rPr>
+          <w:color w:val="000000" w:themeColor="text1"/>
+          <w:sz w:val="22"/>
+          <w:szCs w:val="22"/>
+        </w:rPr>
+        <w:t xml:space="preserve"> </w:t>
+      </w:r>
+      <w:r>
+        <w:rPr>
+          <w:color w:val="000000" w:themeColor="text1"/>
+          <w:sz w:val="22"/>
+          <w:szCs w:val="22"/>
+        </w:rPr>
+        <w:t>gerekiyordu</w:t>
+      </w:r>
+      <w:r>
+        <w:rPr>
+          <w:color w:val="000000" w:themeColor="text1"/>
+          <w:sz w:val="22"/>
+          <w:szCs w:val="22"/>
+        </w:rPr>
+        <w:t>. İlk denemede sepetleri iç içe iki döngüyle yanlış bir aralıkla taradığım için bazı örneklerde tesadüfen doğru sonuç alıyordum ama genel durumda hata veriyordu. Sonrasında her meyve için tüm sepetleri baştan taramam gerektiğini fark etti</w:t>
+      </w:r>
+      <w:r>
+        <w:rPr>
+          <w:color w:val="000000" w:themeColor="text1"/>
+          <w:sz w:val="22"/>
+          <w:szCs w:val="22"/>
+        </w:rPr>
+        <w:t>m ve</w:t>
+      </w:r>
+      <w:r>
+        <w:rPr>
+          <w:color w:val="000000" w:themeColor="text1"/>
+          <w:sz w:val="22"/>
+          <w:szCs w:val="22"/>
+        </w:rPr>
+        <w:t xml:space="preserve"> kullanılan sepeti ayrı bir True/</w:t>
+      </w:r>
+      <w:proofErr w:type="spellStart"/>
+      <w:r>
+        <w:rPr>
+          <w:color w:val="000000" w:themeColor="text1"/>
+          <w:sz w:val="22"/>
+          <w:szCs w:val="22"/>
+        </w:rPr>
+        <w:t>False</w:t>
+      </w:r>
+      <w:proofErr w:type="spellEnd"/>
+      <w:r>
+        <w:rPr>
+          <w:color w:val="000000" w:themeColor="text1"/>
+          <w:sz w:val="22"/>
+          <w:szCs w:val="22"/>
+        </w:rPr>
+        <w:t xml:space="preserve"> listesi tutmadan, doğrudan kapasitesini 0 yaparak işaretledim.</w:t>
+      </w:r>
+    </w:p>
+    <w:p>
+      <w:pPr>
+        <w:pStyle w:val="Balk1"/>
+        <w:spacing w:before="300" w:after="150"/>
+        <w:rPr>
+          <w:color w:val="000000" w:themeColor="text1"/>
+          <w:sz w:val="22"/>
+          <w:szCs w:val="22"/>
+        </w:rPr>
+      </w:pPr>
+      <w:r>
+        <w:rPr>
+          <w:color w:val="000000" w:themeColor="text1"/>
+          <w:sz w:val="22"/>
+          <w:szCs w:val="22"/>
+        </w:rPr>
+        <w:t xml:space="preserve">Zaman karmaşıklığı O(n²) oldu çünkü her meyve için en kötü durumda tüm sepetler taranabiliyor, alan karmaşıklığı ise ekstra bir veri yapısı oluşturmadığım için </w:t>
+      </w:r>
+      <w:proofErr w:type="gramStart"/>
+      <w:r>
+        <w:rPr>
+          <w:color w:val="000000" w:themeColor="text1"/>
+          <w:sz w:val="22"/>
+          <w:szCs w:val="22"/>
+        </w:rPr>
+        <w:t>O(</w:t>
+      </w:r>
+      <w:proofErr w:type="gramEnd"/>
+      <w:r>
+        <w:rPr>
+          <w:color w:val="000000" w:themeColor="text1"/>
+          <w:sz w:val="22"/>
+          <w:szCs w:val="22"/>
+        </w:rPr>
+        <w:t>1) kaldı.</w:t>
+      </w:r>
+    </w:p>
+    <w:p>
+      <w:pPr>
+        <w:pStyle w:val="Balk1"/>
+        <w:spacing w:before="300" w:after="150"/>
+        <w:rPr>
+          <w:color w:val="000000" w:themeColor="text1"/>
+        </w:rPr>
+      </w:pPr>
+    </w:p>
+    <w:p>
+      <w:pPr>
+        <w:pStyle w:val="Balk1"/>
+        <w:spacing w:before="300" w:after="150"/>
+        <w:rPr>
+          <w:b/>
+          <w:bCs/>
+          <w:color w:val="000000" w:themeColor="text1"/>
+        </w:rPr>
+      </w:pPr>
+      <w:r>
+        <w:rPr>
+          <w:b/>
+          <w:bCs/>
+          <w:color w:val="000000" w:themeColor="text1"/>
+        </w:rPr>
+        <w:t>3. Teknik Kaynak Özeti</w:t>
+      </w:r>
+    </w:p>
+    <w:p>
+      <w:pPr>
+        <w:pStyle w:val="Balk1"/>
+        <w:spacing w:before="300" w:after="150"/>
+        <w:rPr>
+          <w:b/>
+          <w:bCs/>
+          <w:color w:val="000000" w:themeColor="text1"/>
+        </w:rPr>
+      </w:pPr>
+      <w:hyperlink r:id="rId6" w:history="1">
+        <w:proofErr w:type="spellStart"/>
+        <w:r>
+          <w:rPr>
+            <w:rStyle w:val="Kpr"/>
+            <w:b/>
+            <w:bCs/>
+          </w:rPr>
+          <w:t>Big</w:t>
+        </w:r>
+        <w:proofErr w:type="spellEnd"/>
+        <w:r>
+          <w:rPr>
+            <w:rStyle w:val="Kpr"/>
+            <w:b/>
+            <w:bCs/>
+          </w:rPr>
+          <w:t xml:space="preserve"> O </w:t>
+        </w:r>
+        <w:proofErr w:type="spellStart"/>
+        <w:r>
+          <w:rPr>
+            <w:rStyle w:val="Kpr"/>
+            <w:b/>
+            <w:bCs/>
+          </w:rPr>
+          <w:t>Notation</w:t>
+        </w:r>
+        <w:proofErr w:type="spellEnd"/>
+        <w:r>
+          <w:rPr>
+            <w:rStyle w:val="Kpr"/>
+            <w:b/>
+            <w:bCs/>
+          </w:rPr>
+          <w:t xml:space="preserve"> </w:t>
+        </w:r>
+        <w:proofErr w:type="spellStart"/>
+        <w:r>
+          <w:rPr>
+            <w:rStyle w:val="Kpr"/>
+            <w:b/>
+            <w:bCs/>
+          </w:rPr>
+          <w:t>Explained</w:t>
+        </w:r>
+        <w:proofErr w:type="spellEnd"/>
+        <w:r>
+          <w:rPr>
+            <w:rStyle w:val="Kpr"/>
+            <w:b/>
+            <w:bCs/>
+          </w:rPr>
+          <w:t xml:space="preserve">, </w:t>
+        </w:r>
+        <w:proofErr w:type="spellStart"/>
+        <w:r>
+          <w:rPr>
+            <w:rStyle w:val="Kpr"/>
+            <w:b/>
+            <w:bCs/>
+          </w:rPr>
+          <w:t>why</w:t>
+        </w:r>
+        <w:proofErr w:type="spellEnd"/>
+        <w:r>
+          <w:rPr>
+            <w:rStyle w:val="Kpr"/>
+            <w:b/>
+            <w:bCs/>
+          </w:rPr>
+          <w:t xml:space="preserve"> is it </w:t>
+        </w:r>
+        <w:proofErr w:type="spellStart"/>
+        <w:r>
+          <w:rPr>
+            <w:rStyle w:val="Kpr"/>
+            <w:b/>
+            <w:bCs/>
+          </w:rPr>
+          <w:t>important</w:t>
+        </w:r>
+        <w:proofErr w:type="spellEnd"/>
+        <w:r>
+          <w:rPr>
+            <w:rStyle w:val="Kpr"/>
+            <w:b/>
+            <w:bCs/>
+          </w:rPr>
+          <w:t>?</w:t>
+        </w:r>
+      </w:hyperlink>
+    </w:p>
+    <w:p>
+      <w:pPr>
+        <w:pStyle w:val="Balk1"/>
+        <w:spacing w:before="300" w:after="150"/>
+        <w:rPr>
+          <w:color w:val="000000" w:themeColor="text1"/>
+          <w:sz w:val="22"/>
+          <w:szCs w:val="22"/>
+        </w:rPr>
+      </w:pPr>
+      <w:r>
+        <w:rPr>
+          <w:color w:val="000000" w:themeColor="text1"/>
+          <w:sz w:val="22"/>
+          <w:szCs w:val="22"/>
+        </w:rPr>
+        <w:t xml:space="preserve">Bu makalede </w:t>
+      </w:r>
+      <w:proofErr w:type="spellStart"/>
+      <w:r>
+        <w:rPr>
+          <w:color w:val="000000" w:themeColor="text1"/>
+          <w:sz w:val="22"/>
+          <w:szCs w:val="22"/>
+        </w:rPr>
+        <w:t>Big</w:t>
+      </w:r>
+      <w:proofErr w:type="spellEnd"/>
+      <w:r>
+        <w:rPr>
+          <w:color w:val="000000" w:themeColor="text1"/>
+          <w:sz w:val="22"/>
+          <w:szCs w:val="22"/>
+        </w:rPr>
+        <w:t xml:space="preserve"> O </w:t>
+      </w:r>
+      <w:proofErr w:type="spellStart"/>
+      <w:r>
+        <w:rPr>
+          <w:color w:val="000000" w:themeColor="text1"/>
+          <w:sz w:val="22"/>
+          <w:szCs w:val="22"/>
+        </w:rPr>
+        <w:t>Notation'ın</w:t>
+      </w:r>
+      <w:proofErr w:type="spellEnd"/>
+      <w:r>
+        <w:rPr>
+          <w:color w:val="000000" w:themeColor="text1"/>
+          <w:sz w:val="22"/>
+          <w:szCs w:val="22"/>
+        </w:rPr>
+        <w:t>, bir algoritmanın girdi büyüklüğü arttıkça performansının nasıl değiştiğini anlamamı sağlayan bir araç olduğunu öğrendim. Doğru algoritmayı seçmek, kodu ölçeklenebilir yazmak ve mülakatlara hazırlanmak için işime yarayacak bir konu.</w:t>
+      </w:r>
+    </w:p>
+    <w:p>
+      <w:pPr>
+        <w:pStyle w:val="Balk1"/>
+        <w:spacing w:before="300" w:after="150"/>
+        <w:rPr>
+          <w:color w:val="000000" w:themeColor="text1"/>
+          <w:sz w:val="22"/>
+          <w:szCs w:val="22"/>
+        </w:rPr>
+      </w:pPr>
+      <w:r>
+        <w:rPr>
+          <w:color w:val="000000" w:themeColor="text1"/>
+          <w:sz w:val="22"/>
+          <w:szCs w:val="22"/>
+        </w:rPr>
+        <w:t xml:space="preserve">Makalede en yaygın karmaşıklık seviyelerini hızlıdan yavaşa doğru sıralamış. </w:t>
+      </w:r>
+      <w:proofErr w:type="gramStart"/>
+      <w:r>
+        <w:rPr>
+          <w:color w:val="000000" w:themeColor="text1"/>
+          <w:sz w:val="22"/>
+          <w:szCs w:val="22"/>
+        </w:rPr>
+        <w:t>O(</w:t>
+      </w:r>
+      <w:proofErr w:type="gramEnd"/>
+      <w:r>
+        <w:rPr>
+          <w:color w:val="000000" w:themeColor="text1"/>
+          <w:sz w:val="22"/>
+          <w:szCs w:val="22"/>
+        </w:rPr>
+        <w:t xml:space="preserve">1) sabit zaman en hızlısı, örneğin bir diziye indeksle erişmek. </w:t>
+      </w:r>
+      <w:proofErr w:type="gramStart"/>
+      <w:r>
+        <w:rPr>
+          <w:color w:val="000000" w:themeColor="text1"/>
+          <w:sz w:val="22"/>
+          <w:szCs w:val="22"/>
+        </w:rPr>
+        <w:t>O(</w:t>
+      </w:r>
+      <w:proofErr w:type="gramEnd"/>
+      <w:r>
+        <w:rPr>
+          <w:color w:val="000000" w:themeColor="text1"/>
+          <w:sz w:val="22"/>
+          <w:szCs w:val="22"/>
+        </w:rPr>
+        <w:t xml:space="preserve">log n) logaritmik zaman, </w:t>
+      </w:r>
+      <w:proofErr w:type="spellStart"/>
+      <w:r>
+        <w:rPr>
+          <w:color w:val="000000" w:themeColor="text1"/>
+          <w:sz w:val="22"/>
+          <w:szCs w:val="22"/>
+        </w:rPr>
+        <w:t>binary</w:t>
+      </w:r>
+      <w:proofErr w:type="spellEnd"/>
+      <w:r>
+        <w:rPr>
+          <w:color w:val="000000" w:themeColor="text1"/>
+          <w:sz w:val="22"/>
+          <w:szCs w:val="22"/>
+        </w:rPr>
+        <w:t xml:space="preserve"> </w:t>
+      </w:r>
+      <w:proofErr w:type="spellStart"/>
+      <w:r>
+        <w:rPr>
+          <w:color w:val="000000" w:themeColor="text1"/>
+          <w:sz w:val="22"/>
+          <w:szCs w:val="22"/>
+        </w:rPr>
+        <w:t>search</w:t>
+      </w:r>
+      <w:proofErr w:type="spellEnd"/>
+      <w:r>
+        <w:rPr>
+          <w:color w:val="000000" w:themeColor="text1"/>
+          <w:sz w:val="22"/>
+          <w:szCs w:val="22"/>
+        </w:rPr>
+        <w:t xml:space="preserve"> gibi</w:t>
+      </w:r>
+      <w:r>
+        <w:rPr>
+          <w:color w:val="000000" w:themeColor="text1"/>
+          <w:sz w:val="22"/>
+          <w:szCs w:val="22"/>
+        </w:rPr>
+        <w:t>.</w:t>
+      </w:r>
+      <w:r>
+        <w:rPr>
+          <w:color w:val="000000" w:themeColor="text1"/>
+          <w:sz w:val="22"/>
+          <w:szCs w:val="22"/>
+        </w:rPr>
+        <w:t xml:space="preserve"> </w:t>
+      </w:r>
+      <w:r>
+        <w:rPr>
+          <w:color w:val="000000" w:themeColor="text1"/>
+          <w:sz w:val="22"/>
+          <w:szCs w:val="22"/>
+        </w:rPr>
+        <w:t>H</w:t>
+      </w:r>
+      <w:r>
+        <w:rPr>
+          <w:color w:val="000000" w:themeColor="text1"/>
+          <w:sz w:val="22"/>
+          <w:szCs w:val="22"/>
+        </w:rPr>
+        <w:t xml:space="preserve">er adımda girdi ciddi şekilde küçülüyor. O(n) doğrusal zaman, bir diziyi baştan sona gezmek ya da </w:t>
+      </w:r>
+      <w:proofErr w:type="spellStart"/>
+      <w:r>
+        <w:rPr>
+          <w:color w:val="000000" w:themeColor="text1"/>
+          <w:sz w:val="22"/>
+          <w:szCs w:val="22"/>
+        </w:rPr>
+        <w:t>linear</w:t>
+      </w:r>
+      <w:proofErr w:type="spellEnd"/>
+      <w:r>
+        <w:rPr>
+          <w:color w:val="000000" w:themeColor="text1"/>
+          <w:sz w:val="22"/>
+          <w:szCs w:val="22"/>
+        </w:rPr>
+        <w:t xml:space="preserve"> </w:t>
+      </w:r>
+      <w:proofErr w:type="spellStart"/>
+      <w:r>
+        <w:rPr>
+          <w:color w:val="000000" w:themeColor="text1"/>
+          <w:sz w:val="22"/>
+          <w:szCs w:val="22"/>
+        </w:rPr>
+        <w:t>search</w:t>
+      </w:r>
+      <w:proofErr w:type="spellEnd"/>
+      <w:r>
+        <w:rPr>
+          <w:color w:val="000000" w:themeColor="text1"/>
+          <w:sz w:val="22"/>
+          <w:szCs w:val="22"/>
+        </w:rPr>
+        <w:t xml:space="preserve"> gibi. </w:t>
+      </w:r>
+      <w:proofErr w:type="gramStart"/>
+      <w:r>
+        <w:rPr>
+          <w:color w:val="000000" w:themeColor="text1"/>
+          <w:sz w:val="22"/>
+          <w:szCs w:val="22"/>
+        </w:rPr>
+        <w:t>O(</w:t>
+      </w:r>
+      <w:proofErr w:type="gramEnd"/>
+      <w:r>
+        <w:rPr>
+          <w:color w:val="000000" w:themeColor="text1"/>
+          <w:sz w:val="22"/>
+          <w:szCs w:val="22"/>
+        </w:rPr>
+        <w:t xml:space="preserve">n log n), </w:t>
+      </w:r>
+      <w:proofErr w:type="spellStart"/>
+      <w:r>
+        <w:rPr>
+          <w:color w:val="000000" w:themeColor="text1"/>
+          <w:sz w:val="22"/>
+          <w:szCs w:val="22"/>
+        </w:rPr>
+        <w:t>Merge</w:t>
+      </w:r>
+      <w:proofErr w:type="spellEnd"/>
+      <w:r>
+        <w:rPr>
+          <w:color w:val="000000" w:themeColor="text1"/>
+          <w:sz w:val="22"/>
+          <w:szCs w:val="22"/>
+        </w:rPr>
+        <w:t xml:space="preserve"> </w:t>
+      </w:r>
+      <w:proofErr w:type="spellStart"/>
+      <w:r>
+        <w:rPr>
+          <w:color w:val="000000" w:themeColor="text1"/>
+          <w:sz w:val="22"/>
+          <w:szCs w:val="22"/>
+        </w:rPr>
+        <w:t>Sort</w:t>
+      </w:r>
+      <w:proofErr w:type="spellEnd"/>
+      <w:r>
+        <w:rPr>
+          <w:color w:val="000000" w:themeColor="text1"/>
+          <w:sz w:val="22"/>
+          <w:szCs w:val="22"/>
+        </w:rPr>
+        <w:t xml:space="preserve"> ve </w:t>
+      </w:r>
+      <w:proofErr w:type="spellStart"/>
+      <w:r>
+        <w:rPr>
+          <w:color w:val="000000" w:themeColor="text1"/>
+          <w:sz w:val="22"/>
+          <w:szCs w:val="22"/>
+        </w:rPr>
+        <w:t>QuickSort</w:t>
+      </w:r>
+      <w:proofErr w:type="spellEnd"/>
+      <w:r>
+        <w:rPr>
+          <w:color w:val="000000" w:themeColor="text1"/>
+          <w:sz w:val="22"/>
+          <w:szCs w:val="22"/>
+        </w:rPr>
+        <w:t xml:space="preserve"> gibi verimli sıralama algoritmaları. O(n²) karesel zaman, iç içe döngüler yani </w:t>
+      </w:r>
+      <w:proofErr w:type="spellStart"/>
+      <w:r>
+        <w:rPr>
+          <w:color w:val="000000" w:themeColor="text1"/>
+          <w:sz w:val="22"/>
+          <w:szCs w:val="22"/>
+        </w:rPr>
+        <w:t>Bubble</w:t>
+      </w:r>
+      <w:proofErr w:type="spellEnd"/>
+      <w:r>
+        <w:rPr>
+          <w:color w:val="000000" w:themeColor="text1"/>
+          <w:sz w:val="22"/>
+          <w:szCs w:val="22"/>
+        </w:rPr>
+        <w:t xml:space="preserve"> </w:t>
+      </w:r>
+      <w:proofErr w:type="spellStart"/>
+      <w:r>
+        <w:rPr>
+          <w:color w:val="000000" w:themeColor="text1"/>
+          <w:sz w:val="22"/>
+          <w:szCs w:val="22"/>
+        </w:rPr>
+        <w:t>Sort</w:t>
+      </w:r>
+      <w:proofErr w:type="spellEnd"/>
+      <w:r>
+        <w:rPr>
+          <w:color w:val="000000" w:themeColor="text1"/>
+          <w:sz w:val="22"/>
+          <w:szCs w:val="22"/>
+        </w:rPr>
+        <w:t xml:space="preserve"> ve </w:t>
+      </w:r>
+      <w:proofErr w:type="spellStart"/>
+      <w:r>
+        <w:rPr>
+          <w:color w:val="000000" w:themeColor="text1"/>
+          <w:sz w:val="22"/>
+          <w:szCs w:val="22"/>
+        </w:rPr>
+        <w:t>Selection</w:t>
+      </w:r>
+      <w:proofErr w:type="spellEnd"/>
+      <w:r>
+        <w:rPr>
+          <w:color w:val="000000" w:themeColor="text1"/>
+          <w:sz w:val="22"/>
+          <w:szCs w:val="22"/>
+        </w:rPr>
+        <w:t xml:space="preserve"> </w:t>
+      </w:r>
+      <w:proofErr w:type="spellStart"/>
+      <w:r>
+        <w:rPr>
+          <w:color w:val="000000" w:themeColor="text1"/>
+          <w:sz w:val="22"/>
+          <w:szCs w:val="22"/>
+        </w:rPr>
+        <w:t>Sort</w:t>
+      </w:r>
+      <w:proofErr w:type="spellEnd"/>
+      <w:r>
+        <w:rPr>
+          <w:color w:val="000000" w:themeColor="text1"/>
+          <w:sz w:val="22"/>
+          <w:szCs w:val="22"/>
+        </w:rPr>
+        <w:t xml:space="preserve"> gibi. O(2ⁿ) üstel zaman, </w:t>
+      </w:r>
+      <w:proofErr w:type="spellStart"/>
+      <w:r>
+        <w:rPr>
+          <w:color w:val="000000" w:themeColor="text1"/>
+          <w:sz w:val="22"/>
+          <w:szCs w:val="22"/>
+        </w:rPr>
+        <w:t>recursive</w:t>
+      </w:r>
+      <w:proofErr w:type="spellEnd"/>
+      <w:r>
+        <w:rPr>
+          <w:color w:val="000000" w:themeColor="text1"/>
+          <w:sz w:val="22"/>
+          <w:szCs w:val="22"/>
+        </w:rPr>
+        <w:t xml:space="preserve"> </w:t>
+      </w:r>
+      <w:proofErr w:type="spellStart"/>
+      <w:r>
+        <w:rPr>
+          <w:color w:val="000000" w:themeColor="text1"/>
+          <w:sz w:val="22"/>
+          <w:szCs w:val="22"/>
+        </w:rPr>
+        <w:t>Fibonacci</w:t>
+      </w:r>
+      <w:proofErr w:type="spellEnd"/>
+      <w:r>
+        <w:rPr>
+          <w:color w:val="000000" w:themeColor="text1"/>
+          <w:sz w:val="22"/>
+          <w:szCs w:val="22"/>
+        </w:rPr>
+        <w:t xml:space="preserve"> gibi. O(n!) faktöriyel zaman, gezgin satıcı problemi gibi kaba kuvvet çözümler. Son iki karmaşıklığın girdi büyüdükçe pratikte kullanılamaz hale geldiğini belirtmiş.</w:t>
+      </w:r>
+    </w:p>
+    <w:p>
+      <w:pPr>
+        <w:pStyle w:val="Balk1"/>
+        <w:spacing w:before="300" w:after="150"/>
+        <w:rPr>
+          <w:color w:val="000000" w:themeColor="text1"/>
+          <w:sz w:val="22"/>
+          <w:szCs w:val="22"/>
+        </w:rPr>
+      </w:pPr>
+      <w:r>
+        <w:rPr>
+          <w:color w:val="000000" w:themeColor="text1"/>
+          <w:sz w:val="22"/>
+          <w:szCs w:val="22"/>
+        </w:rPr>
+        <w:t xml:space="preserve">Ayrıca pratik öneriler de vermiş. Arama yaparken </w:t>
+      </w:r>
+      <w:proofErr w:type="spellStart"/>
+      <w:r>
+        <w:rPr>
+          <w:color w:val="000000" w:themeColor="text1"/>
+          <w:sz w:val="22"/>
+          <w:szCs w:val="22"/>
+        </w:rPr>
+        <w:t>linear</w:t>
+      </w:r>
+      <w:proofErr w:type="spellEnd"/>
+      <w:r>
+        <w:rPr>
+          <w:color w:val="000000" w:themeColor="text1"/>
+          <w:sz w:val="22"/>
+          <w:szCs w:val="22"/>
+        </w:rPr>
+        <w:t xml:space="preserve"> </w:t>
+      </w:r>
+      <w:proofErr w:type="spellStart"/>
+      <w:r>
+        <w:rPr>
+          <w:color w:val="000000" w:themeColor="text1"/>
+          <w:sz w:val="22"/>
+          <w:szCs w:val="22"/>
+        </w:rPr>
+        <w:t>search</w:t>
+      </w:r>
+      <w:proofErr w:type="spellEnd"/>
+      <w:r>
+        <w:rPr>
+          <w:color w:val="000000" w:themeColor="text1"/>
+          <w:sz w:val="22"/>
+          <w:szCs w:val="22"/>
+        </w:rPr>
+        <w:t xml:space="preserve"> yerine </w:t>
+      </w:r>
+      <w:proofErr w:type="spellStart"/>
+      <w:r>
+        <w:rPr>
+          <w:color w:val="000000" w:themeColor="text1"/>
+          <w:sz w:val="22"/>
+          <w:szCs w:val="22"/>
+        </w:rPr>
+        <w:t>binary</w:t>
+      </w:r>
+      <w:proofErr w:type="spellEnd"/>
+      <w:r>
+        <w:rPr>
+          <w:color w:val="000000" w:themeColor="text1"/>
+          <w:sz w:val="22"/>
+          <w:szCs w:val="22"/>
+        </w:rPr>
+        <w:t xml:space="preserve"> </w:t>
+      </w:r>
+      <w:proofErr w:type="spellStart"/>
+      <w:r>
+        <w:rPr>
+          <w:color w:val="000000" w:themeColor="text1"/>
+          <w:sz w:val="22"/>
+          <w:szCs w:val="22"/>
+        </w:rPr>
+        <w:t>search</w:t>
+      </w:r>
+      <w:proofErr w:type="spellEnd"/>
+      <w:r>
+        <w:rPr>
+          <w:color w:val="000000" w:themeColor="text1"/>
+          <w:sz w:val="22"/>
+          <w:szCs w:val="22"/>
+        </w:rPr>
+        <w:t xml:space="preserve">, sıralama yaparken </w:t>
+      </w:r>
+      <w:proofErr w:type="spellStart"/>
+      <w:r>
+        <w:rPr>
+          <w:color w:val="000000" w:themeColor="text1"/>
+          <w:sz w:val="22"/>
+          <w:szCs w:val="22"/>
+        </w:rPr>
+        <w:t>bubble</w:t>
+      </w:r>
+      <w:proofErr w:type="spellEnd"/>
+      <w:r>
+        <w:rPr>
+          <w:color w:val="000000" w:themeColor="text1"/>
+          <w:sz w:val="22"/>
+          <w:szCs w:val="22"/>
+        </w:rPr>
+        <w:t xml:space="preserve"> </w:t>
+      </w:r>
+      <w:proofErr w:type="spellStart"/>
+      <w:r>
+        <w:rPr>
+          <w:color w:val="000000" w:themeColor="text1"/>
+          <w:sz w:val="22"/>
+          <w:szCs w:val="22"/>
+        </w:rPr>
+        <w:t>sort</w:t>
+      </w:r>
+      <w:proofErr w:type="spellEnd"/>
+      <w:r>
+        <w:rPr>
+          <w:color w:val="000000" w:themeColor="text1"/>
+          <w:sz w:val="22"/>
+          <w:szCs w:val="22"/>
+        </w:rPr>
+        <w:t xml:space="preserve"> yerine </w:t>
+      </w:r>
+      <w:proofErr w:type="spellStart"/>
+      <w:r>
+        <w:rPr>
+          <w:color w:val="000000" w:themeColor="text1"/>
+          <w:sz w:val="22"/>
+          <w:szCs w:val="22"/>
+        </w:rPr>
+        <w:t>merge</w:t>
+      </w:r>
+      <w:proofErr w:type="spellEnd"/>
+      <w:r>
+        <w:rPr>
+          <w:color w:val="000000" w:themeColor="text1"/>
+          <w:sz w:val="22"/>
+          <w:szCs w:val="22"/>
+        </w:rPr>
+        <w:t xml:space="preserve"> </w:t>
+      </w:r>
+      <w:proofErr w:type="spellStart"/>
+      <w:r>
+        <w:rPr>
+          <w:color w:val="000000" w:themeColor="text1"/>
+          <w:sz w:val="22"/>
+          <w:szCs w:val="22"/>
+        </w:rPr>
+        <w:t>sort</w:t>
+      </w:r>
+      <w:proofErr w:type="spellEnd"/>
+      <w:r>
+        <w:rPr>
+          <w:color w:val="000000" w:themeColor="text1"/>
+          <w:sz w:val="22"/>
+          <w:szCs w:val="22"/>
+        </w:rPr>
+        <w:t xml:space="preserve"> tercih edilmeli. Hızlı erişim gerekiyorsa </w:t>
+      </w:r>
+      <w:proofErr w:type="spellStart"/>
+      <w:r>
+        <w:rPr>
+          <w:color w:val="000000" w:themeColor="text1"/>
+          <w:sz w:val="22"/>
+          <w:szCs w:val="22"/>
+        </w:rPr>
+        <w:t>hash</w:t>
+      </w:r>
+      <w:proofErr w:type="spellEnd"/>
+      <w:r>
+        <w:rPr>
+          <w:color w:val="000000" w:themeColor="text1"/>
+          <w:sz w:val="22"/>
+          <w:szCs w:val="22"/>
+        </w:rPr>
+        <w:t xml:space="preserve"> </w:t>
+      </w:r>
+      <w:proofErr w:type="spellStart"/>
+      <w:r>
+        <w:rPr>
+          <w:color w:val="000000" w:themeColor="text1"/>
+          <w:sz w:val="22"/>
+          <w:szCs w:val="22"/>
+        </w:rPr>
+        <w:t>table</w:t>
+      </w:r>
+      <w:proofErr w:type="spellEnd"/>
+      <w:r>
+        <w:rPr>
+          <w:color w:val="000000" w:themeColor="text1"/>
+          <w:sz w:val="22"/>
+          <w:szCs w:val="22"/>
+        </w:rPr>
+        <w:t xml:space="preserve"> kullanılmalı. Son olarak gerçek performansın sadece </w:t>
+      </w:r>
+      <w:proofErr w:type="spellStart"/>
+      <w:r>
+        <w:rPr>
+          <w:color w:val="000000" w:themeColor="text1"/>
+          <w:sz w:val="22"/>
+          <w:szCs w:val="22"/>
+        </w:rPr>
+        <w:t>Big</w:t>
+      </w:r>
+      <w:proofErr w:type="spellEnd"/>
+      <w:r>
+        <w:rPr>
+          <w:color w:val="000000" w:themeColor="text1"/>
+          <w:sz w:val="22"/>
+          <w:szCs w:val="22"/>
+        </w:rPr>
+        <w:t xml:space="preserve"> O'ya değil, en iyi ortalama en kötü durum senaryolarına ve donanım ile sistem yükü gibi dış etkenlere de bağlı olduğunu vurgulamış. Yani </w:t>
+      </w:r>
+      <w:proofErr w:type="spellStart"/>
+      <w:r>
+        <w:rPr>
+          <w:color w:val="000000" w:themeColor="text1"/>
+          <w:sz w:val="22"/>
+          <w:szCs w:val="22"/>
+        </w:rPr>
+        <w:t>Big</w:t>
+      </w:r>
+      <w:proofErr w:type="spellEnd"/>
+      <w:r>
+        <w:rPr>
+          <w:color w:val="000000" w:themeColor="text1"/>
+          <w:sz w:val="22"/>
+          <w:szCs w:val="22"/>
+        </w:rPr>
+        <w:t xml:space="preserve"> O faydalı bir teorik araç ama tek başına gerçek çalışma süresini belirlemiyor.</w:t>
+      </w:r>
+    </w:p>
+    <w:p>
+      <w:pPr>
+        <w:pStyle w:val="Balk1"/>
+        <w:spacing w:before="300" w:after="150"/>
+        <w:rPr>
+          <w:color w:val="000000" w:themeColor="text1"/>
+          <w:sz w:val="22"/>
+          <w:szCs w:val="22"/>
+        </w:rPr>
+      </w:pPr>
+    </w:p>
+    <w:p>
+      <w:pPr>
+        <w:pStyle w:val="Balk1"/>
+        <w:spacing w:before="300" w:after="150"/>
+        <w:rPr>
+          <w:b/>
+          <w:bCs/>
+          <w:color w:val="000000" w:themeColor="text1"/>
+        </w:rPr>
+      </w:pPr>
+      <w:r>
+        <w:rPr>
+          <w:b/>
+          <w:bCs/>
+          <w:color w:val="000000" w:themeColor="text1"/>
+        </w:rPr>
+        <w:lastRenderedPageBreak/>
         <w:t>4. Uyku Takip Tablosu</w:t>
       </w:r>
     </w:p>
@@ -399,15 +3375,7 @@
                 <w:sz w:val="22"/>
                 <w:szCs w:val="22"/>
               </w:rPr>
-              <w:t>24</w:t>
-            </w:r>
-            <w:r>
-              <w:rPr>
-                <w:color w:val="000000" w:themeColor="text1"/>
-                <w:sz w:val="22"/>
-                <w:szCs w:val="22"/>
-              </w:rPr>
-              <w:t>.</w:t>
+              <w:t>24.</w:t>
             </w:r>
             <w:r>
               <w:rPr>
@@ -476,6 +3444,16 @@
             <w:vAlign w:val="center"/>
           </w:tcPr>
           <w:p>
+            <w:proofErr w:type="spellStart"/>
+            <w:proofErr w:type="gramStart"/>
+            <w:r>
+              <w:rPr>
+                <w:color w:val="1A1A1A"/>
+                <w:sz w:val="19"/>
+                <w:szCs w:val="19"/>
+              </w:rPr>
+              <w:t>s</w:t>
+            </w:r>
             <w:r>
               <w:rPr>
                 <w:color w:val="1A1A1A"/>
@@ -483,6 +3461,31 @@
                 <w:szCs w:val="19"/>
               </w:rPr>
               <w:t>Salı</w:t>
+            </w:r>
+            <w:proofErr w:type="spellEnd"/>
+            <w:proofErr w:type="gramEnd"/>
+          </w:p>
+        </w:tc>
+        <w:tc>
+          <w:tcPr>
+            <w:tcW w:w="2024" w:type="dxa"/>
+            <w:vAlign w:val="center"/>
+          </w:tcPr>
+          <w:p>
+            <w:pPr>
+              <w:rPr>
+                <w:color w:val="000000" w:themeColor="text1"/>
+                <w:sz w:val="22"/>
+                <w:szCs w:val="22"/>
+              </w:rPr>
+            </w:pPr>
+            <w:r>
+              <w:rPr>
+                <w:color w:val="000000" w:themeColor="text1"/>
+                <w:sz w:val="22"/>
+                <w:szCs w:val="22"/>
+              </w:rPr>
+              <w:t>23.00</w:t>
             </w:r>
           </w:p>
         </w:tc>
@@ -499,21 +3502,14 @@
                 <w:szCs w:val="22"/>
               </w:rPr>
             </w:pPr>
-          </w:p>
-        </w:tc>
-        <w:tc>
-          <w:tcPr>
-            <w:tcW w:w="2024" w:type="dxa"/>
-            <w:vAlign w:val="center"/>
-          </w:tcPr>
-          <w:p>
-            <w:pPr>
+            <w:r>
               <w:rPr>
                 <w:color w:val="000000" w:themeColor="text1"/>
                 <w:sz w:val="22"/>
                 <w:szCs w:val="22"/>
               </w:rPr>
-            </w:pPr>
+              <w:t>8.00</w:t>
+            </w:r>
           </w:p>
         </w:tc>
         <w:tc>
@@ -529,6 +3525,14 @@
                 <w:szCs w:val="22"/>
               </w:rPr>
             </w:pPr>
+            <w:r>
+              <w:rPr>
+                <w:color w:val="000000" w:themeColor="text1"/>
+                <w:sz w:val="22"/>
+                <w:szCs w:val="22"/>
+              </w:rPr>
+              <w:t>9.00</w:t>
+            </w:r>
           </w:p>
         </w:tc>
       </w:tr>
@@ -565,6 +3569,14 @@
                 <w:szCs w:val="22"/>
               </w:rPr>
             </w:pPr>
+            <w:r>
+              <w:rPr>
+                <w:color w:val="000000" w:themeColor="text1"/>
+                <w:sz w:val="22"/>
+                <w:szCs w:val="22"/>
+              </w:rPr>
+              <w:t>01.00</w:t>
+            </w:r>
           </w:p>
         </w:tc>
         <w:tc>
@@ -580,6 +3592,14 @@
                 <w:szCs w:val="22"/>
               </w:rPr>
             </w:pPr>
+            <w:r>
+              <w:rPr>
+                <w:color w:val="000000" w:themeColor="text1"/>
+                <w:sz w:val="22"/>
+                <w:szCs w:val="22"/>
+              </w:rPr>
+              <w:t>9.30</w:t>
+            </w:r>
           </w:p>
         </w:tc>
         <w:tc>
@@ -595,6 +3615,14 @@
                 <w:szCs w:val="22"/>
               </w:rPr>
             </w:pPr>
+            <w:r>
+              <w:rPr>
+                <w:color w:val="000000" w:themeColor="text1"/>
+                <w:sz w:val="22"/>
+                <w:szCs w:val="22"/>
+              </w:rPr>
+              <w:t>8.30</w:t>
+            </w:r>
           </w:p>
         </w:tc>
       </w:tr>
@@ -631,6 +3659,14 @@
                 <w:szCs w:val="22"/>
               </w:rPr>
             </w:pPr>
+            <w:r>
+              <w:rPr>
+                <w:color w:val="000000" w:themeColor="text1"/>
+                <w:sz w:val="22"/>
+                <w:szCs w:val="22"/>
+              </w:rPr>
+              <w:t>24.00</w:t>
+            </w:r>
           </w:p>
         </w:tc>
         <w:tc>
@@ -646,6 +3682,14 @@
                 <w:szCs w:val="22"/>
               </w:rPr>
             </w:pPr>
+            <w:r>
+              <w:rPr>
+                <w:color w:val="000000" w:themeColor="text1"/>
+                <w:sz w:val="22"/>
+                <w:szCs w:val="22"/>
+              </w:rPr>
+              <w:t>8.15</w:t>
+            </w:r>
           </w:p>
         </w:tc>
         <w:tc>
@@ -661,6 +3705,14 @@
                 <w:szCs w:val="22"/>
               </w:rPr>
             </w:pPr>
+            <w:r>
+              <w:rPr>
+                <w:color w:val="000000" w:themeColor="text1"/>
+                <w:sz w:val="22"/>
+                <w:szCs w:val="22"/>
+              </w:rPr>
+              <w:t>8.15</w:t>
+            </w:r>
           </w:p>
         </w:tc>
       </w:tr>
@@ -697,6 +3749,14 @@
                 <w:szCs w:val="22"/>
               </w:rPr>
             </w:pPr>
+            <w:r>
+              <w:rPr>
+                <w:color w:val="000000" w:themeColor="text1"/>
+                <w:sz w:val="22"/>
+                <w:szCs w:val="22"/>
+              </w:rPr>
+              <w:t>23.30</w:t>
+            </w:r>
           </w:p>
         </w:tc>
         <w:tc>
@@ -712,6 +3772,14 @@
                 <w:szCs w:val="22"/>
               </w:rPr>
             </w:pPr>
+            <w:r>
+              <w:rPr>
+                <w:color w:val="000000" w:themeColor="text1"/>
+                <w:sz w:val="22"/>
+                <w:szCs w:val="22"/>
+              </w:rPr>
+              <w:t>9.00</w:t>
+            </w:r>
           </w:p>
         </w:tc>
         <w:tc>
@@ -727,6 +3795,14 @@
                 <w:szCs w:val="22"/>
               </w:rPr>
             </w:pPr>
+            <w:r>
+              <w:rPr>
+                <w:color w:val="000000" w:themeColor="text1"/>
+                <w:sz w:val="22"/>
+                <w:szCs w:val="22"/>
+              </w:rPr>
+              <w:t>9.30</w:t>
+            </w:r>
           </w:p>
         </w:tc>
       </w:tr>
@@ -763,6 +3839,14 @@
                 <w:szCs w:val="22"/>
               </w:rPr>
             </w:pPr>
+            <w:r>
+              <w:rPr>
+                <w:color w:val="000000" w:themeColor="text1"/>
+                <w:sz w:val="22"/>
+                <w:szCs w:val="22"/>
+              </w:rPr>
+              <w:t>24.00</w:t>
+            </w:r>
           </w:p>
         </w:tc>
         <w:tc>
@@ -778,6 +3862,14 @@
                 <w:szCs w:val="22"/>
               </w:rPr>
             </w:pPr>
+            <w:r>
+              <w:rPr>
+                <w:color w:val="000000" w:themeColor="text1"/>
+                <w:sz w:val="22"/>
+                <w:szCs w:val="22"/>
+              </w:rPr>
+              <w:t>8.30</w:t>
+            </w:r>
           </w:p>
         </w:tc>
         <w:tc>
@@ -793,6 +3885,14 @@
                 <w:szCs w:val="22"/>
               </w:rPr>
             </w:pPr>
+            <w:r>
+              <w:rPr>
+                <w:color w:val="000000" w:themeColor="text1"/>
+                <w:sz w:val="22"/>
+                <w:szCs w:val="22"/>
+              </w:rPr>
+              <w:t>8.30</w:t>
+            </w:r>
           </w:p>
         </w:tc>
       </w:tr>
@@ -829,6 +3929,14 @@
                 <w:szCs w:val="22"/>
               </w:rPr>
             </w:pPr>
+            <w:r>
+              <w:rPr>
+                <w:color w:val="000000" w:themeColor="text1"/>
+                <w:sz w:val="22"/>
+                <w:szCs w:val="22"/>
+              </w:rPr>
+              <w:t>24.00</w:t>
+            </w:r>
           </w:p>
         </w:tc>
         <w:tc>
@@ -844,6 +3952,14 @@
                 <w:szCs w:val="22"/>
               </w:rPr>
             </w:pPr>
+            <w:r>
+              <w:rPr>
+                <w:color w:val="000000" w:themeColor="text1"/>
+                <w:sz w:val="22"/>
+                <w:szCs w:val="22"/>
+              </w:rPr>
+              <w:t>8.00</w:t>
+            </w:r>
           </w:p>
         </w:tc>
         <w:tc>
@@ -859,6 +3975,14 @@
                 <w:szCs w:val="22"/>
               </w:rPr>
             </w:pPr>
+            <w:r>
+              <w:rPr>
+                <w:color w:val="000000" w:themeColor="text1"/>
+                <w:sz w:val="22"/>
+                <w:szCs w:val="22"/>
+              </w:rPr>
+              <w:t>8.00</w:t>
+            </w:r>
           </w:p>
         </w:tc>
       </w:tr>
@@ -869,8 +3993,18 @@
         <w:spacing w:before="300" w:after="150"/>
         <w:rPr>
           <w:color w:val="000000" w:themeColor="text1"/>
-        </w:rPr>
-      </w:pPr>
+          <w:sz w:val="22"/>
+          <w:szCs w:val="22"/>
+        </w:rPr>
+      </w:pPr>
+      <w:r>
+        <w:rPr>
+          <w:color w:val="000000" w:themeColor="text1"/>
+          <w:sz w:val="22"/>
+          <w:szCs w:val="22"/>
+        </w:rPr>
+        <w:t>Ortalama:8 saat 28 dakika</w:t>
+      </w:r>
     </w:p>
     <w:p>
       <w:pPr>
@@ -885,11 +4019,15 @@
         <w:pStyle w:val="Balk1"/>
         <w:spacing w:before="300" w:after="150"/>
         <w:rPr>
-          <w:color w:val="000000" w:themeColor="text1"/>
-        </w:rPr>
-      </w:pPr>
-      <w:r>
-        <w:rPr>
+          <w:b/>
+          <w:bCs/>
+          <w:color w:val="000000" w:themeColor="text1"/>
+        </w:rPr>
+      </w:pPr>
+      <w:r>
+        <w:rPr>
+          <w:b/>
+          <w:bCs/>
           <w:color w:val="000000" w:themeColor="text1"/>
         </w:rPr>
         <w:t>5. Nerede Zorlandım ve Takıldım</w:t>
@@ -901,18 +4039,713 @@
         <w:spacing w:before="300" w:after="150"/>
         <w:rPr>
           <w:color w:val="000000" w:themeColor="text1"/>
-        </w:rPr>
-      </w:pPr>
-      <w:r>
-        <w:rPr>
-          <w:color w:val="000000" w:themeColor="text1"/>
-        </w:rPr>
-        <w:t>6. Haftalık Genel Değerlendirme</w:t>
+          <w:sz w:val="22"/>
+          <w:szCs w:val="22"/>
+        </w:rPr>
+      </w:pPr>
+      <w:proofErr w:type="spellStart"/>
+      <w:r>
+        <w:rPr>
+          <w:color w:val="000000" w:themeColor="text1"/>
+          <w:sz w:val="22"/>
+          <w:szCs w:val="22"/>
+        </w:rPr>
+        <w:t>Binary</w:t>
+      </w:r>
+      <w:proofErr w:type="spellEnd"/>
+      <w:r>
+        <w:rPr>
+          <w:color w:val="000000" w:themeColor="text1"/>
+          <w:sz w:val="22"/>
+          <w:szCs w:val="22"/>
+        </w:rPr>
+        <w:t xml:space="preserve"> </w:t>
+      </w:r>
+      <w:proofErr w:type="spellStart"/>
+      <w:r>
+        <w:rPr>
+          <w:color w:val="000000" w:themeColor="text1"/>
+          <w:sz w:val="22"/>
+          <w:szCs w:val="22"/>
+        </w:rPr>
+        <w:t>Search</w:t>
+      </w:r>
+      <w:proofErr w:type="spellEnd"/>
+      <w:r>
+        <w:rPr>
+          <w:color w:val="000000" w:themeColor="text1"/>
+          <w:sz w:val="22"/>
+          <w:szCs w:val="22"/>
+        </w:rPr>
+        <w:t xml:space="preserve"> denince aklımda hep sıralı bir listede sayı arama</w:t>
+      </w:r>
+      <w:r>
+        <w:rPr>
+          <w:color w:val="000000" w:themeColor="text1"/>
+          <w:sz w:val="22"/>
+          <w:szCs w:val="22"/>
+        </w:rPr>
+        <w:t xml:space="preserve"> </w:t>
+      </w:r>
+      <w:r>
+        <w:rPr>
+          <w:color w:val="000000" w:themeColor="text1"/>
+          <w:sz w:val="22"/>
+          <w:szCs w:val="22"/>
+        </w:rPr>
+        <w:t xml:space="preserve">vardı. Maximum </w:t>
+      </w:r>
+      <w:proofErr w:type="spellStart"/>
+      <w:r>
+        <w:rPr>
+          <w:color w:val="000000" w:themeColor="text1"/>
+          <w:sz w:val="22"/>
+          <w:szCs w:val="22"/>
+        </w:rPr>
+        <w:t>Tastiness</w:t>
+      </w:r>
+      <w:proofErr w:type="spellEnd"/>
+      <w:r>
+        <w:rPr>
+          <w:color w:val="000000" w:themeColor="text1"/>
+          <w:sz w:val="22"/>
+          <w:szCs w:val="22"/>
+        </w:rPr>
+        <w:t xml:space="preserve"> problemine gelince bu tanım </w:t>
+      </w:r>
+      <w:proofErr w:type="gramStart"/>
+      <w:r>
+        <w:rPr>
+          <w:color w:val="000000" w:themeColor="text1"/>
+          <w:sz w:val="22"/>
+          <w:szCs w:val="22"/>
+        </w:rPr>
+        <w:t xml:space="preserve">yetmedi </w:t>
+      </w:r>
+      <w:r>
+        <w:rPr>
+          <w:color w:val="000000" w:themeColor="text1"/>
+          <w:sz w:val="22"/>
+          <w:szCs w:val="22"/>
+        </w:rPr>
+        <w:t>.B</w:t>
+      </w:r>
+      <w:r>
+        <w:rPr>
+          <w:color w:val="000000" w:themeColor="text1"/>
+          <w:sz w:val="22"/>
+          <w:szCs w:val="22"/>
+        </w:rPr>
+        <w:t>urada</w:t>
+      </w:r>
+      <w:proofErr w:type="gramEnd"/>
+      <w:r>
+        <w:rPr>
+          <w:color w:val="000000" w:themeColor="text1"/>
+          <w:sz w:val="22"/>
+          <w:szCs w:val="22"/>
+        </w:rPr>
+        <w:t xml:space="preserve"> aradığım şey listede bir eleman değil, olabilecek en iyi cevaptı. İlk okuduğumda bu nasıl </w:t>
+      </w:r>
+      <w:proofErr w:type="spellStart"/>
+      <w:r>
+        <w:rPr>
+          <w:color w:val="000000" w:themeColor="text1"/>
+          <w:sz w:val="22"/>
+          <w:szCs w:val="22"/>
+        </w:rPr>
+        <w:t>binary</w:t>
+      </w:r>
+      <w:proofErr w:type="spellEnd"/>
+      <w:r>
+        <w:rPr>
+          <w:color w:val="000000" w:themeColor="text1"/>
+          <w:sz w:val="22"/>
+          <w:szCs w:val="22"/>
+        </w:rPr>
+        <w:t xml:space="preserve"> </w:t>
+      </w:r>
+      <w:proofErr w:type="spellStart"/>
+      <w:r>
+        <w:rPr>
+          <w:color w:val="000000" w:themeColor="text1"/>
+          <w:sz w:val="22"/>
+          <w:szCs w:val="22"/>
+        </w:rPr>
+        <w:t>search</w:t>
+      </w:r>
+      <w:proofErr w:type="spellEnd"/>
+      <w:r>
+        <w:rPr>
+          <w:color w:val="000000" w:themeColor="text1"/>
+          <w:sz w:val="22"/>
+          <w:szCs w:val="22"/>
+        </w:rPr>
+        <w:t xml:space="preserve"> oluyor diye biraz takıldım ama fiyat farkının da aslında 0 ile en büyük fark arasında bir arama alanı</w:t>
+      </w:r>
+      <w:r>
+        <w:rPr>
+          <w:color w:val="000000" w:themeColor="text1"/>
+          <w:sz w:val="22"/>
+          <w:szCs w:val="22"/>
+        </w:rPr>
+        <w:t xml:space="preserve"> </w:t>
+      </w:r>
+      <w:r>
+        <w:rPr>
+          <w:color w:val="000000" w:themeColor="text1"/>
+          <w:sz w:val="22"/>
+          <w:szCs w:val="22"/>
+        </w:rPr>
+        <w:t>olduğunu görünce mantık oturdu.</w:t>
       </w:r>
     </w:p>
     <w:p>
       <w:pPr>
-        <w:spacing w:before="200"/>
+        <w:pStyle w:val="Balk1"/>
+        <w:spacing w:before="300" w:after="150"/>
+        <w:rPr>
+          <w:color w:val="000000" w:themeColor="text1"/>
+          <w:sz w:val="22"/>
+          <w:szCs w:val="22"/>
+        </w:rPr>
+      </w:pPr>
+      <w:proofErr w:type="spellStart"/>
+      <w:r>
+        <w:rPr>
+          <w:color w:val="000000" w:themeColor="text1"/>
+          <w:sz w:val="22"/>
+          <w:szCs w:val="22"/>
+        </w:rPr>
+        <w:t>Fruits</w:t>
+      </w:r>
+      <w:proofErr w:type="spellEnd"/>
+      <w:r>
+        <w:rPr>
+          <w:color w:val="000000" w:themeColor="text1"/>
+          <w:sz w:val="22"/>
+          <w:szCs w:val="22"/>
+        </w:rPr>
+        <w:t xml:space="preserve"> </w:t>
+      </w:r>
+      <w:proofErr w:type="spellStart"/>
+      <w:r>
+        <w:rPr>
+          <w:color w:val="000000" w:themeColor="text1"/>
+          <w:sz w:val="22"/>
+          <w:szCs w:val="22"/>
+        </w:rPr>
+        <w:t>Into</w:t>
+      </w:r>
+      <w:proofErr w:type="spellEnd"/>
+      <w:r>
+        <w:rPr>
+          <w:color w:val="000000" w:themeColor="text1"/>
+          <w:sz w:val="22"/>
+          <w:szCs w:val="22"/>
+        </w:rPr>
+        <w:t xml:space="preserve"> </w:t>
+      </w:r>
+      <w:proofErr w:type="spellStart"/>
+      <w:r>
+        <w:rPr>
+          <w:color w:val="000000" w:themeColor="text1"/>
+          <w:sz w:val="22"/>
+          <w:szCs w:val="22"/>
+        </w:rPr>
+        <w:t>Baskets'ta</w:t>
+      </w:r>
+      <w:proofErr w:type="spellEnd"/>
+      <w:r>
+        <w:rPr>
+          <w:color w:val="000000" w:themeColor="text1"/>
+          <w:sz w:val="22"/>
+          <w:szCs w:val="22"/>
+        </w:rPr>
+        <w:t xml:space="preserve"> ise daha çok kod seviyesinde bir hata yaptım. İlk yazdığım çözüm bazı örneklerde doğru sonuç veriyordu ama genelde yanlıştı, çünkü iç döngüyü yanlış bir yerden başlatmıştım ve bir eşitlik durumunu (&gt;=) atlamıştım. Testler geçmeyince kodu satır </w:t>
+      </w:r>
+      <w:proofErr w:type="spellStart"/>
+      <w:r>
+        <w:rPr>
+          <w:color w:val="000000" w:themeColor="text1"/>
+          <w:sz w:val="22"/>
+          <w:szCs w:val="22"/>
+        </w:rPr>
+        <w:t>satır</w:t>
+      </w:r>
+      <w:proofErr w:type="spellEnd"/>
+      <w:r>
+        <w:rPr>
+          <w:color w:val="000000" w:themeColor="text1"/>
+          <w:sz w:val="22"/>
+          <w:szCs w:val="22"/>
+        </w:rPr>
+        <w:t xml:space="preserve"> elle çalıştırıp nerede yanlış gittiğini bulmam gerekti bu da bana tesadüfen doğru sonuç ile gerçekten doğru mantık arasındaki farkı bir kez daha hatırlattı.</w:t>
+      </w:r>
+    </w:p>
+    <w:p>
+      <w:pPr>
+        <w:pStyle w:val="Balk1"/>
+        <w:spacing w:before="300" w:after="150"/>
+        <w:rPr>
+          <w:color w:val="000000" w:themeColor="text1"/>
+        </w:rPr>
+      </w:pPr>
+    </w:p>
+    <w:p>
+      <w:pPr>
+        <w:pStyle w:val="Balk1"/>
+        <w:spacing w:before="300" w:after="150"/>
+        <w:rPr>
+          <w:b/>
+          <w:bCs/>
+          <w:color w:val="000000" w:themeColor="text1"/>
+        </w:rPr>
+      </w:pPr>
+      <w:r>
+        <w:rPr>
+          <w:b/>
+          <w:bCs/>
+          <w:color w:val="000000" w:themeColor="text1"/>
+        </w:rPr>
+        <w:t>6. Haftalık Genel Değerlendirme</w:t>
+      </w:r>
+    </w:p>
+    <w:p>
+      <w:pPr>
+        <w:pStyle w:val="Balk1"/>
+        <w:spacing w:before="300" w:after="150"/>
+        <w:rPr>
+          <w:color w:val="000000" w:themeColor="text1"/>
+        </w:rPr>
+      </w:pPr>
+      <w:r>
+        <w:rPr>
+          <w:color w:val="000000" w:themeColor="text1"/>
+          <w:sz w:val="22"/>
+          <w:szCs w:val="22"/>
+        </w:rPr>
+        <w:t xml:space="preserve">Bu hafta </w:t>
+      </w:r>
+      <w:proofErr w:type="spellStart"/>
+      <w:r>
+        <w:rPr>
+          <w:color w:val="000000" w:themeColor="text1"/>
+          <w:sz w:val="22"/>
+          <w:szCs w:val="22"/>
+        </w:rPr>
+        <w:t>Linear</w:t>
+      </w:r>
+      <w:proofErr w:type="spellEnd"/>
+      <w:r>
+        <w:rPr>
+          <w:color w:val="000000" w:themeColor="text1"/>
+          <w:sz w:val="22"/>
+          <w:szCs w:val="22"/>
+        </w:rPr>
+        <w:t xml:space="preserve"> </w:t>
+      </w:r>
+      <w:proofErr w:type="spellStart"/>
+      <w:r>
+        <w:rPr>
+          <w:color w:val="000000" w:themeColor="text1"/>
+          <w:sz w:val="22"/>
+          <w:szCs w:val="22"/>
+        </w:rPr>
+        <w:t>Search</w:t>
+      </w:r>
+      <w:proofErr w:type="spellEnd"/>
+      <w:r>
+        <w:rPr>
+          <w:color w:val="000000" w:themeColor="text1"/>
+          <w:sz w:val="22"/>
+          <w:szCs w:val="22"/>
+        </w:rPr>
+        <w:t xml:space="preserve"> ve </w:t>
+      </w:r>
+      <w:proofErr w:type="spellStart"/>
+      <w:r>
+        <w:rPr>
+          <w:color w:val="000000" w:themeColor="text1"/>
+          <w:sz w:val="22"/>
+          <w:szCs w:val="22"/>
+        </w:rPr>
+        <w:t>Binary</w:t>
+      </w:r>
+      <w:proofErr w:type="spellEnd"/>
+      <w:r>
+        <w:rPr>
+          <w:color w:val="000000" w:themeColor="text1"/>
+          <w:sz w:val="22"/>
+          <w:szCs w:val="22"/>
+        </w:rPr>
+        <w:t xml:space="preserve"> </w:t>
+      </w:r>
+      <w:proofErr w:type="spellStart"/>
+      <w:r>
+        <w:rPr>
+          <w:color w:val="000000" w:themeColor="text1"/>
+          <w:sz w:val="22"/>
+          <w:szCs w:val="22"/>
+        </w:rPr>
+        <w:t>Search'ü</w:t>
+      </w:r>
+      <w:proofErr w:type="spellEnd"/>
+      <w:r>
+        <w:rPr>
+          <w:color w:val="000000" w:themeColor="text1"/>
+          <w:sz w:val="22"/>
+          <w:szCs w:val="22"/>
+        </w:rPr>
+        <w:t xml:space="preserve"> sıfırdan yazarak başladım</w:t>
+      </w:r>
+      <w:r>
+        <w:rPr>
+          <w:color w:val="000000" w:themeColor="text1"/>
+          <w:sz w:val="22"/>
+          <w:szCs w:val="22"/>
+        </w:rPr>
+        <w:t>.</w:t>
+      </w:r>
+      <w:r>
+        <w:rPr>
+          <w:color w:val="000000" w:themeColor="text1"/>
+          <w:sz w:val="22"/>
+          <w:szCs w:val="22"/>
+        </w:rPr>
+        <w:t xml:space="preserve"> </w:t>
+      </w:r>
+      <w:proofErr w:type="spellStart"/>
+      <w:r>
+        <w:rPr>
+          <w:color w:val="000000" w:themeColor="text1"/>
+          <w:sz w:val="22"/>
+          <w:szCs w:val="22"/>
+        </w:rPr>
+        <w:t>Binary</w:t>
+      </w:r>
+      <w:proofErr w:type="spellEnd"/>
+      <w:r>
+        <w:rPr>
+          <w:color w:val="000000" w:themeColor="text1"/>
+          <w:sz w:val="22"/>
+          <w:szCs w:val="22"/>
+        </w:rPr>
+        <w:t xml:space="preserve"> </w:t>
+      </w:r>
+      <w:proofErr w:type="spellStart"/>
+      <w:r>
+        <w:rPr>
+          <w:color w:val="000000" w:themeColor="text1"/>
+          <w:sz w:val="22"/>
+          <w:szCs w:val="22"/>
+        </w:rPr>
+        <w:t>Search'ün</w:t>
+      </w:r>
+      <w:proofErr w:type="spellEnd"/>
+      <w:r>
+        <w:rPr>
+          <w:color w:val="000000" w:themeColor="text1"/>
+          <w:sz w:val="22"/>
+          <w:szCs w:val="22"/>
+        </w:rPr>
+        <w:t xml:space="preserve"> </w:t>
+      </w:r>
+      <w:proofErr w:type="gramStart"/>
+      <w:r>
+        <w:rPr>
+          <w:color w:val="000000" w:themeColor="text1"/>
+          <w:sz w:val="22"/>
+          <w:szCs w:val="22"/>
+        </w:rPr>
+        <w:t>O(</w:t>
+      </w:r>
+      <w:proofErr w:type="gramEnd"/>
+      <w:r>
+        <w:rPr>
+          <w:color w:val="000000" w:themeColor="text1"/>
+          <w:sz w:val="22"/>
+          <w:szCs w:val="22"/>
+        </w:rPr>
+        <w:t xml:space="preserve">log n) olmasını </w:t>
+      </w:r>
+      <w:proofErr w:type="gramStart"/>
+      <w:r>
+        <w:rPr>
+          <w:color w:val="000000" w:themeColor="text1"/>
+          <w:sz w:val="22"/>
+          <w:szCs w:val="22"/>
+        </w:rPr>
+        <w:t>kağıt</w:t>
+      </w:r>
+      <w:proofErr w:type="gramEnd"/>
+      <w:r>
+        <w:rPr>
+          <w:color w:val="000000" w:themeColor="text1"/>
+          <w:sz w:val="22"/>
+          <w:szCs w:val="22"/>
+        </w:rPr>
+        <w:t xml:space="preserve"> üzerinde kanıtladım</w:t>
+      </w:r>
+      <w:r>
+        <w:rPr>
+          <w:color w:val="000000" w:themeColor="text1"/>
+          <w:sz w:val="22"/>
+          <w:szCs w:val="22"/>
+        </w:rPr>
+        <w:t>.</w:t>
+      </w:r>
+      <w:r>
+        <w:rPr>
+          <w:color w:val="000000" w:themeColor="text1"/>
+          <w:sz w:val="22"/>
+          <w:szCs w:val="22"/>
+        </w:rPr>
+        <w:t xml:space="preserve"> </w:t>
+      </w:r>
+      <w:r>
+        <w:rPr>
+          <w:color w:val="000000" w:themeColor="text1"/>
+          <w:sz w:val="22"/>
+          <w:szCs w:val="22"/>
+        </w:rPr>
+        <w:t>A</w:t>
+      </w:r>
+      <w:r>
+        <w:rPr>
+          <w:color w:val="000000" w:themeColor="text1"/>
+          <w:sz w:val="22"/>
+          <w:szCs w:val="22"/>
+        </w:rPr>
+        <w:t>rdından üç temel sıralama algoritmasını (</w:t>
+      </w:r>
+      <w:proofErr w:type="spellStart"/>
+      <w:r>
+        <w:rPr>
+          <w:color w:val="000000" w:themeColor="text1"/>
+          <w:sz w:val="22"/>
+          <w:szCs w:val="22"/>
+        </w:rPr>
+        <w:t>Bubble</w:t>
+      </w:r>
+      <w:proofErr w:type="spellEnd"/>
+      <w:r>
+        <w:rPr>
+          <w:color w:val="000000" w:themeColor="text1"/>
+          <w:sz w:val="22"/>
+          <w:szCs w:val="22"/>
+        </w:rPr>
+        <w:t xml:space="preserve">, </w:t>
+      </w:r>
+      <w:proofErr w:type="spellStart"/>
+      <w:r>
+        <w:rPr>
+          <w:color w:val="000000" w:themeColor="text1"/>
+          <w:sz w:val="22"/>
+          <w:szCs w:val="22"/>
+        </w:rPr>
+        <w:t>Selection</w:t>
+      </w:r>
+      <w:proofErr w:type="spellEnd"/>
+      <w:r>
+        <w:rPr>
+          <w:color w:val="000000" w:themeColor="text1"/>
+          <w:sz w:val="22"/>
+          <w:szCs w:val="22"/>
+        </w:rPr>
+        <w:t xml:space="preserve">, </w:t>
+      </w:r>
+      <w:proofErr w:type="spellStart"/>
+      <w:r>
+        <w:rPr>
+          <w:color w:val="000000" w:themeColor="text1"/>
+          <w:sz w:val="22"/>
+          <w:szCs w:val="22"/>
+        </w:rPr>
+        <w:t>Insertion</w:t>
+      </w:r>
+      <w:proofErr w:type="spellEnd"/>
+      <w:r>
+        <w:rPr>
+          <w:color w:val="000000" w:themeColor="text1"/>
+          <w:sz w:val="22"/>
+          <w:szCs w:val="22"/>
+        </w:rPr>
+        <w:t xml:space="preserve"> </w:t>
+      </w:r>
+      <w:proofErr w:type="spellStart"/>
+      <w:r>
+        <w:rPr>
+          <w:color w:val="000000" w:themeColor="text1"/>
+          <w:sz w:val="22"/>
+          <w:szCs w:val="22"/>
+        </w:rPr>
+        <w:t>Sort</w:t>
+      </w:r>
+      <w:proofErr w:type="spellEnd"/>
+      <w:r>
+        <w:rPr>
+          <w:color w:val="000000" w:themeColor="text1"/>
+          <w:sz w:val="22"/>
+          <w:szCs w:val="22"/>
+        </w:rPr>
+        <w:t xml:space="preserve">) </w:t>
+      </w:r>
+      <w:proofErr w:type="spellStart"/>
+      <w:r>
+        <w:rPr>
+          <w:color w:val="000000" w:themeColor="text1"/>
+          <w:sz w:val="22"/>
+          <w:szCs w:val="22"/>
+        </w:rPr>
+        <w:t>implement</w:t>
+      </w:r>
+      <w:proofErr w:type="spellEnd"/>
+      <w:r>
+        <w:rPr>
+          <w:color w:val="000000" w:themeColor="text1"/>
+          <w:sz w:val="22"/>
+          <w:szCs w:val="22"/>
+        </w:rPr>
+        <w:t xml:space="preserve"> edip her birinin zaman ve alan karmaşıklığını çıkardım. </w:t>
+      </w:r>
+      <w:proofErr w:type="spellStart"/>
+      <w:r>
+        <w:rPr>
+          <w:color w:val="000000" w:themeColor="text1"/>
+          <w:sz w:val="22"/>
+          <w:szCs w:val="22"/>
+        </w:rPr>
+        <w:t>LeetCode</w:t>
+      </w:r>
+      <w:proofErr w:type="spellEnd"/>
+      <w:r>
+        <w:rPr>
+          <w:color w:val="000000" w:themeColor="text1"/>
+          <w:sz w:val="22"/>
+          <w:szCs w:val="22"/>
+        </w:rPr>
+        <w:t xml:space="preserve"> tarafında planın istediği 2 </w:t>
+      </w:r>
+      <w:proofErr w:type="spellStart"/>
+      <w:r>
+        <w:rPr>
+          <w:color w:val="000000" w:themeColor="text1"/>
+          <w:sz w:val="22"/>
+          <w:szCs w:val="22"/>
+        </w:rPr>
+        <w:t>Easy</w:t>
+      </w:r>
+      <w:proofErr w:type="spellEnd"/>
+      <w:r>
+        <w:rPr>
+          <w:color w:val="000000" w:themeColor="text1"/>
+          <w:sz w:val="22"/>
+          <w:szCs w:val="22"/>
+        </w:rPr>
+        <w:t xml:space="preserve"> + 1 </w:t>
+      </w:r>
+      <w:proofErr w:type="spellStart"/>
+      <w:r>
+        <w:rPr>
+          <w:color w:val="000000" w:themeColor="text1"/>
+          <w:sz w:val="22"/>
+          <w:szCs w:val="22"/>
+        </w:rPr>
+        <w:t>Medium</w:t>
+      </w:r>
+      <w:proofErr w:type="spellEnd"/>
+      <w:r>
+        <w:rPr>
+          <w:color w:val="000000" w:themeColor="text1"/>
+          <w:sz w:val="22"/>
+          <w:szCs w:val="22"/>
+        </w:rPr>
+        <w:t xml:space="preserve"> problemi tamamladım ve </w:t>
+      </w:r>
+      <w:proofErr w:type="spellStart"/>
+      <w:r>
+        <w:rPr>
+          <w:color w:val="000000" w:themeColor="text1"/>
+          <w:sz w:val="22"/>
+          <w:szCs w:val="22"/>
+        </w:rPr>
+        <w:t>binary</w:t>
+      </w:r>
+      <w:proofErr w:type="spellEnd"/>
+      <w:r>
+        <w:rPr>
+          <w:color w:val="000000" w:themeColor="text1"/>
+          <w:sz w:val="22"/>
+          <w:szCs w:val="22"/>
+        </w:rPr>
+        <w:t xml:space="preserve"> </w:t>
+      </w:r>
+      <w:proofErr w:type="spellStart"/>
+      <w:r>
+        <w:rPr>
+          <w:color w:val="000000" w:themeColor="text1"/>
+          <w:sz w:val="22"/>
+          <w:szCs w:val="22"/>
+        </w:rPr>
+        <w:t>search'ün</w:t>
+      </w:r>
+      <w:proofErr w:type="spellEnd"/>
+      <w:r>
+        <w:rPr>
+          <w:color w:val="000000" w:themeColor="text1"/>
+          <w:sz w:val="22"/>
+          <w:szCs w:val="22"/>
+        </w:rPr>
+        <w:t xml:space="preserve"> sadece klasik arama değil, cevap arama tekniği olarak da kullanılabildiğini öğrendim. Ayrıca </w:t>
+      </w:r>
+      <w:proofErr w:type="spellStart"/>
+      <w:r>
+        <w:rPr>
+          <w:color w:val="000000" w:themeColor="text1"/>
+          <w:sz w:val="22"/>
+          <w:szCs w:val="22"/>
+        </w:rPr>
+        <w:t>Big</w:t>
+      </w:r>
+      <w:proofErr w:type="spellEnd"/>
+      <w:r>
+        <w:rPr>
+          <w:color w:val="000000" w:themeColor="text1"/>
+          <w:sz w:val="22"/>
+          <w:szCs w:val="22"/>
+        </w:rPr>
+        <w:t xml:space="preserve"> O </w:t>
+      </w:r>
+      <w:proofErr w:type="spellStart"/>
+      <w:r>
+        <w:rPr>
+          <w:color w:val="000000" w:themeColor="text1"/>
+          <w:sz w:val="22"/>
+          <w:szCs w:val="22"/>
+        </w:rPr>
+        <w:t>Notation</w:t>
+      </w:r>
+      <w:proofErr w:type="spellEnd"/>
+      <w:r>
+        <w:rPr>
+          <w:color w:val="000000" w:themeColor="text1"/>
+          <w:sz w:val="22"/>
+          <w:szCs w:val="22"/>
+        </w:rPr>
+        <w:t xml:space="preserve"> üzerine bir teknik makale okuyup özetledim. Hafta 2 planındaki tüm görevleri tamamlamış oldum</w:t>
+      </w:r>
+      <w:r>
+        <w:rPr>
+          <w:color w:val="000000" w:themeColor="text1"/>
+        </w:rPr>
+        <w:t>.</w:t>
+      </w:r>
+    </w:p>
+    <w:p>
+      <w:pPr>
+        <w:pStyle w:val="Balk1"/>
+        <w:spacing w:before="300" w:after="150"/>
         <w:rPr>
           <w:color w:val="000000" w:themeColor="text1"/>
         </w:rPr>
@@ -959,6 +4792,118 @@
 <file path=word/numbering.xml><?xml version="1.0" encoding="utf-8"?>
 <w:numbering xmlns:wpc="http://schemas.microsoft.com/office/word/2010/wordprocessingCanvas" xmlns:cx="http://schemas.microsoft.com/office/drawing/2014/chartex" xmlns:cx1="http://schemas.microsoft.com/office/drawing/2015/9/8/chartex" xmlns:cx2="http://schemas.microsoft.com/office/drawing/2015/10/21/chartex" xmlns:cx3="http://schemas.microsoft.com/office/drawing/2016/5/9/chartex" xmlns:cx4="http://schemas.microsoft.com/office/drawing/2016/5/10/chartex" xmlns:cx5="http://schemas.microsoft.com/office/drawing/2016/5/11/chartex" xmlns:cx6="http://schemas.microsoft.com/office/drawing/2016/5/12/chartex" xmlns:cx7="http://schemas.microsoft.com/office/drawing/2016/5/13/chartex" xmlns:cx8="http://schemas.microsoft.com/office/drawing/2016/5/14/chartex" xmlns:mc="http://schemas.openxmlformats.org/markup-compatibility/2006" xmlns:aink="http://schemas.microsoft.com/office/drawing/2016/ink" xmlns:am3d="http://schemas.microsoft.com/office/drawing/2017/model3d" xmlns:o="urn:schemas-microsoft-com:office:office" xmlns:oel="http://schemas.microsoft.com/office/2019/extlst" xmlns:r="http://schemas.openxmlformats.org/officeDocument/2006/relationships" xmlns:m="http://schemas.openxmlformats.org/officeDocument/2006/math" xmlns:v="urn:schemas-microsoft-com:vml" xmlns:wp14="http://schemas.microsoft.com/office/word/2010/wordprocessingDrawing" xmlns:wp="http://schemas.openxmlformats.org/drawingml/2006/wordprocessingDrawing" xmlns:w10="urn:schemas-microsoft-com:office:word" xmlns:w="http://schemas.openxmlformats.org/wordprocessingml/2006/main" xmlns:w14="http://schemas.microsoft.com/office/word/2010/wordml" xmlns:w15="http://schemas.microsoft.com/office/word/2012/wordml" xmlns:w16cex="http://schemas.microsoft.com/office/word/2018/wordml/cex" xmlns:w16cid="http://schemas.microsoft.com/office/word/2016/wordml/cid" xmlns:w16="http://schemas.microsoft.com/office/word/2018/wordml" xmlns:w16du="http://schemas.microsoft.com/office/word/2023/wordml/word16du" xmlns:w16sdtdh="http://schemas.microsoft.com/office/word/2020/wordml/sdtdatahash" xmlns:w16sdtfl="http://schemas.microsoft.com/office/word/2024/wordml/sdtformatlock" xmlns:w16se="http://schemas.microsoft.com/office/word/2015/wordml/symex" xmlns:wpg="http://schemas.microsoft.com/office/word/2010/wordprocessingGroup" xmlns:wpi="http://schemas.microsoft.com/office/word/2010/wordprocessingInk" xmlns:wne="http://schemas.microsoft.com/office/word/2006/wordml" xmlns:wps="http://schemas.microsoft.com/office/word/2010/wordprocessingShape" mc:Ignorable="w14 w15 w16se w16cid w16 w16cex w16sdtdh w16sdtfl w16du wp14">
   <w:abstractNum w:abstractNumId="0" w15:restartNumberingAfterBreak="0">
+    <w:nsid w:val="187333FB"/>
+    <w:multiLevelType w:val="hybridMultilevel"/>
+    <w:tmpl w:val="0DCA3A30"/>
+    <w:lvl w:ilvl="0" w:tplc="933C0688">
+      <w:numFmt w:val="bullet"/>
+      <w:lvlText w:val="-"/>
+      <w:lvlJc w:val="left"/>
+      <w:pPr>
+        <w:ind w:left="720" w:hanging="360"/>
+      </w:pPr>
+      <w:rPr>
+        <w:rFonts w:ascii="Times New Roman" w:eastAsia="Times New Roman" w:hAnsi="Times New Roman" w:cs="Times New Roman" w:hint="default"/>
+      </w:rPr>
+    </w:lvl>
+    <w:lvl w:ilvl="1" w:tplc="041F0003" w:tentative="1">
+      <w:start w:val="1"/>
+      <w:numFmt w:val="bullet"/>
+      <w:lvlText w:val="o"/>
+      <w:lvlJc w:val="left"/>
+      <w:pPr>
+        <w:ind w:left="1440" w:hanging="360"/>
+      </w:pPr>
+      <w:rPr>
+        <w:rFonts w:ascii="Courier New" w:hAnsi="Courier New" w:cs="Courier New" w:hint="default"/>
+      </w:rPr>
+    </w:lvl>
+    <w:lvl w:ilvl="2" w:tplc="041F0005" w:tentative="1">
+      <w:start w:val="1"/>
+      <w:numFmt w:val="bullet"/>
+      <w:lvlText w:val=""/>
+      <w:lvlJc w:val="left"/>
+      <w:pPr>
+        <w:ind w:left="2160" w:hanging="360"/>
+      </w:pPr>
+      <w:rPr>
+        <w:rFonts w:ascii="Wingdings" w:hAnsi="Wingdings" w:hint="default"/>
+      </w:rPr>
+    </w:lvl>
+    <w:lvl w:ilvl="3" w:tplc="041F0001" w:tentative="1">
+      <w:start w:val="1"/>
+      <w:numFmt w:val="bullet"/>
+      <w:lvlText w:val=""/>
+      <w:lvlJc w:val="left"/>
+      <w:pPr>
+        <w:ind w:left="2880" w:hanging="360"/>
+      </w:pPr>
+      <w:rPr>
+        <w:rFonts w:ascii="Symbol" w:hAnsi="Symbol" w:hint="default"/>
+      </w:rPr>
+    </w:lvl>
+    <w:lvl w:ilvl="4" w:tplc="041F0003" w:tentative="1">
+      <w:start w:val="1"/>
+      <w:numFmt w:val="bullet"/>
+      <w:lvlText w:val="o"/>
+      <w:lvlJc w:val="left"/>
+      <w:pPr>
+        <w:ind w:left="3600" w:hanging="360"/>
+      </w:pPr>
+      <w:rPr>
+        <w:rFonts w:ascii="Courier New" w:hAnsi="Courier New" w:cs="Courier New" w:hint="default"/>
+      </w:rPr>
+    </w:lvl>
+    <w:lvl w:ilvl="5" w:tplc="041F0005" w:tentative="1">
+      <w:start w:val="1"/>
+      <w:numFmt w:val="bullet"/>
+      <w:lvlText w:val=""/>
+      <w:lvlJc w:val="left"/>
+      <w:pPr>
+        <w:ind w:left="4320" w:hanging="360"/>
+      </w:pPr>
+      <w:rPr>
+        <w:rFonts w:ascii="Wingdings" w:hAnsi="Wingdings" w:hint="default"/>
+      </w:rPr>
+    </w:lvl>
+    <w:lvl w:ilvl="6" w:tplc="041F0001" w:tentative="1">
+      <w:start w:val="1"/>
+      <w:numFmt w:val="bullet"/>
+      <w:lvlText w:val=""/>
+      <w:lvlJc w:val="left"/>
+      <w:pPr>
+        <w:ind w:left="5040" w:hanging="360"/>
+      </w:pPr>
+      <w:rPr>
+        <w:rFonts w:ascii="Symbol" w:hAnsi="Symbol" w:hint="default"/>
+      </w:rPr>
+    </w:lvl>
+    <w:lvl w:ilvl="7" w:tplc="041F0003" w:tentative="1">
+      <w:start w:val="1"/>
+      <w:numFmt w:val="bullet"/>
+      <w:lvlText w:val="o"/>
+      <w:lvlJc w:val="left"/>
+      <w:pPr>
+        <w:ind w:left="5760" w:hanging="360"/>
+      </w:pPr>
+      <w:rPr>
+        <w:rFonts w:ascii="Courier New" w:hAnsi="Courier New" w:cs="Courier New" w:hint="default"/>
+      </w:rPr>
+    </w:lvl>
+    <w:lvl w:ilvl="8" w:tplc="041F0005" w:tentative="1">
+      <w:start w:val="1"/>
+      <w:numFmt w:val="bullet"/>
+      <w:lvlText w:val=""/>
+      <w:lvlJc w:val="left"/>
+      <w:pPr>
+        <w:ind w:left="6480" w:hanging="360"/>
+      </w:pPr>
+      <w:rPr>
+        <w:rFonts w:ascii="Wingdings" w:hAnsi="Wingdings" w:hint="default"/>
+      </w:rPr>
+    </w:lvl>
+  </w:abstractNum>
+  <w:abstractNum w:abstractNumId="1" w15:restartNumberingAfterBreak="0">
     <w:nsid w:val="60A4431A"/>
     <w:multiLevelType w:val="hybridMultilevel"/>
     <w:tmpl w:val="65D8A0E2"/>
@@ -1045,10 +4990,13 @@
     </w:lvl>
   </w:abstractNum>
   <w:num w:numId="1" w16cid:durableId="1510218723">
-    <w:abstractNumId w:val="0"/>
+    <w:abstractNumId w:val="1"/>
     <w:lvlOverride w:ilvl="0">
       <w:startOverride w:val="1"/>
     </w:lvlOverride>
+  </w:num>
+  <w:num w:numId="2" w16cid:durableId="2112771986">
+    <w:abstractNumId w:val="0"/>
   </w:num>
 </w:numbering>
 </file>

</xml_diff>